<commit_message>
Update BET HMI Architecture and How.docx
</commit_message>
<xml_diff>
--- a/BET HMI Architecture and How.docx
+++ b/BET HMI Architecture and How.docx
@@ -32,7 +32,7 @@
         </w:rPr>
         <w:t xml:space="preserve">There are two HMI displays mounted on M2 truck: Driver display sits behind the steering wheel and the Status display is on the right of the driver. Both the displays are based on the TouchGFX toolchain. The required installation files can be found on the </w:t>
       </w:r>
-      <w:hyperlink r:id="rId5" w:history="1">
+      <w:hyperlink r:id="rId6" w:history="1">
         <w:r>
           <w:rPr>
             <w:rStyle w:val="Hyperlink"/>
@@ -54,7 +54,7 @@
         </w:rPr>
         <w:t xml:space="preserve">The implementation for both the displays can found on </w:t>
       </w:r>
-      <w:hyperlink r:id="rId6" w:history="1">
+      <w:hyperlink r:id="rId7" w:history="1">
         <w:r>
           <w:rPr>
             <w:rStyle w:val="Hyperlink"/>
@@ -260,7 +260,7 @@
             <wp:cNvGraphicFramePr/>
             <a:graphic xmlns:a="http://schemas.openxmlformats.org/drawingml/2006/main">
               <a:graphicData uri="http://schemas.openxmlformats.org/drawingml/2006/diagram">
-                <dgm:relIds xmlns:dgm="http://schemas.openxmlformats.org/drawingml/2006/diagram" xmlns:r="http://schemas.openxmlformats.org/officeDocument/2006/relationships" r:dm="rId7" r:lo="rId8" r:qs="rId9" r:cs="rId10"/>
+                <dgm:relIds xmlns:dgm="http://schemas.openxmlformats.org/drawingml/2006/diagram" xmlns:r="http://schemas.openxmlformats.org/officeDocument/2006/relationships" r:dm="rId8" r:lo="rId9" r:qs="rId10" r:cs="rId11"/>
               </a:graphicData>
             </a:graphic>
           </wp:inline>
@@ -473,7 +473,7 @@
             <wp:cNvGraphicFramePr/>
             <a:graphic xmlns:a="http://schemas.openxmlformats.org/drawingml/2006/main">
               <a:graphicData uri="http://schemas.openxmlformats.org/drawingml/2006/diagram">
-                <dgm:relIds xmlns:dgm="http://schemas.openxmlformats.org/drawingml/2006/diagram" xmlns:r="http://schemas.openxmlformats.org/officeDocument/2006/relationships" r:dm="rId12" r:lo="rId13" r:qs="rId14" r:cs="rId15"/>
+                <dgm:relIds xmlns:dgm="http://schemas.openxmlformats.org/drawingml/2006/diagram" xmlns:r="http://schemas.openxmlformats.org/officeDocument/2006/relationships" r:dm="rId13" r:lo="rId14" r:qs="rId15" r:cs="rId16"/>
               </a:graphicData>
             </a:graphic>
           </wp:inline>
@@ -540,7 +540,7 @@
                     <pic:cNvPicPr/>
                   </pic:nvPicPr>
                   <pic:blipFill>
-                    <a:blip r:embed="rId17"/>
+                    <a:blip r:embed="rId18"/>
                     <a:stretch>
                       <a:fillRect/>
                     </a:stretch>
@@ -775,7 +775,7 @@
                     <pic:cNvPicPr/>
                   </pic:nvPicPr>
                   <pic:blipFill>
-                    <a:blip r:embed="rId18"/>
+                    <a:blip r:embed="rId19"/>
                     <a:stretch>
                       <a:fillRect/>
                     </a:stretch>
@@ -821,7 +821,7 @@
         </w:rPr>
         <w:t xml:space="preserve">The other two parameters are a bit tricky. These values specify the bitrate. We are communication over CAN at 500000 bits/s. These set the time segments for the CAN transceiver on the display to adhere to this bit rate. More information can be found at the </w:t>
       </w:r>
-      <w:hyperlink r:id="rId19" w:history="1">
+      <w:hyperlink r:id="rId20" w:history="1">
         <w:r>
           <w:rPr>
             <w:rStyle w:val="Hyperlink"/>
@@ -895,7 +895,7 @@
         </w:rPr>
         <w:t xml:space="preserve">CubeMX has a really nice </w:t>
       </w:r>
-      <w:hyperlink r:id="rId20" w:history="1">
+      <w:hyperlink r:id="rId21" w:history="1">
         <w:r>
           <w:rPr>
             <w:rStyle w:val="Hyperlink"/>
@@ -923,7 +923,7 @@
         </w:rPr>
         <w:t xml:space="preserve">Finally, the TouchGFX framework doesn’t use the FreeRTOS APIs and system calls directly. It uses the </w:t>
       </w:r>
-      <w:hyperlink r:id="rId21" w:history="1">
+      <w:hyperlink r:id="rId22" w:history="1">
         <w:r>
           <w:rPr>
             <w:rStyle w:val="Hyperlink"/>
@@ -1000,7 +1000,7 @@
                     <pic:cNvPicPr/>
                   </pic:nvPicPr>
                   <pic:blipFill>
-                    <a:blip r:embed="rId22"/>
+                    <a:blip r:embed="rId23"/>
                     <a:stretch>
                       <a:fillRect/>
                     </a:stretch>
@@ -1078,145 +1078,61 @@
           <w:lang w:val="fr-FR"/>
         </w:rPr>
       </w:pPr>
-      <w:proofErr w:type="gramStart"/>
       <w:r>
         <w:rPr>
           <w:rFonts w:ascii="Courier New" w:hAnsi="Courier New" w:cs="Courier New"/>
           <w:lang w:val="fr-FR"/>
         </w:rPr>
-        <w:t>typedef</w:t>
-      </w:r>
-      <w:proofErr w:type="gramEnd"/>
-      <w:r>
+        <w:t>typedef struct {</w:t>
+      </w:r>
+    </w:p>
+    <w:p>
+      <w:pPr>
+        <w:spacing w:after="0"/>
         <w:rPr>
           <w:rFonts w:ascii="Courier New" w:hAnsi="Courier New" w:cs="Courier New"/>
           <w:lang w:val="fr-FR"/>
         </w:rPr>
-        <w:t xml:space="preserve"> struct {</w:t>
-      </w:r>
-    </w:p>
-    <w:p>
-      <w:pPr>
-        <w:spacing w:after="0"/>
+      </w:pPr>
+      <w:r>
         <w:rPr>
           <w:rFonts w:ascii="Courier New" w:hAnsi="Courier New" w:cs="Courier New"/>
           <w:lang w:val="fr-FR"/>
         </w:rPr>
-      </w:pPr>
-      <w:r>
+        <w:t>    uint8_t Pres_Susp_Front;</w:t>
+      </w:r>
+    </w:p>
+    <w:p>
+      <w:pPr>
+        <w:spacing w:after="0"/>
         <w:rPr>
           <w:rFonts w:ascii="Courier New" w:hAnsi="Courier New" w:cs="Courier New"/>
           <w:lang w:val="fr-FR"/>
         </w:rPr>
-        <w:t xml:space="preserve">    </w:t>
-      </w:r>
-      <w:proofErr w:type="gramStart"/>
+      </w:pPr>
       <w:r>
         <w:rPr>
           <w:rFonts w:ascii="Courier New" w:hAnsi="Courier New" w:cs="Courier New"/>
           <w:lang w:val="fr-FR"/>
         </w:rPr>
-        <w:t>uint</w:t>
-      </w:r>
-      <w:proofErr w:type="gramEnd"/>
-      <w:r>
+        <w:t>    uint8_t Pres_Susp_Rear;</w:t>
+      </w:r>
+    </w:p>
+    <w:p>
+      <w:pPr>
+        <w:spacing w:after="0"/>
         <w:rPr>
           <w:rFonts w:ascii="Courier New" w:hAnsi="Courier New" w:cs="Courier New"/>
           <w:lang w:val="fr-FR"/>
         </w:rPr>
-        <w:t>8_t Pres_Susp_</w:t>
-      </w:r>
-      <w:proofErr w:type="gramStart"/>
+      </w:pPr>
       <w:r>
         <w:rPr>
           <w:rFonts w:ascii="Courier New" w:hAnsi="Courier New" w:cs="Courier New"/>
           <w:lang w:val="fr-FR"/>
         </w:rPr>
-        <w:t>Front;</w:t>
-      </w:r>
-      <w:proofErr w:type="gramEnd"/>
-    </w:p>
-    <w:p>
-      <w:pPr>
-        <w:spacing w:after="0"/>
-        <w:rPr>
-          <w:rFonts w:ascii="Courier New" w:hAnsi="Courier New" w:cs="Courier New"/>
-          <w:lang w:val="fr-FR"/>
-        </w:rPr>
-      </w:pPr>
-      <w:r>
-        <w:rPr>
-          <w:rFonts w:ascii="Courier New" w:hAnsi="Courier New" w:cs="Courier New"/>
-          <w:lang w:val="fr-FR"/>
-        </w:rPr>
-        <w:t xml:space="preserve">    </w:t>
-      </w:r>
-      <w:proofErr w:type="gramStart"/>
-      <w:r>
-        <w:rPr>
-          <w:rFonts w:ascii="Courier New" w:hAnsi="Courier New" w:cs="Courier New"/>
-          <w:lang w:val="fr-FR"/>
-        </w:rPr>
-        <w:t>uint</w:t>
-      </w:r>
-      <w:proofErr w:type="gramEnd"/>
-      <w:r>
-        <w:rPr>
-          <w:rFonts w:ascii="Courier New" w:hAnsi="Courier New" w:cs="Courier New"/>
-          <w:lang w:val="fr-FR"/>
-        </w:rPr>
-        <w:t>8_t Pres_Susp_</w:t>
-      </w:r>
-      <w:proofErr w:type="gramStart"/>
-      <w:r>
-        <w:rPr>
-          <w:rFonts w:ascii="Courier New" w:hAnsi="Courier New" w:cs="Courier New"/>
-          <w:lang w:val="fr-FR"/>
-        </w:rPr>
-        <w:t>Rear;</w:t>
-      </w:r>
-      <w:proofErr w:type="gramEnd"/>
-    </w:p>
-    <w:p>
-      <w:pPr>
-        <w:spacing w:after="0"/>
-        <w:rPr>
-          <w:rFonts w:ascii="Courier New" w:hAnsi="Courier New" w:cs="Courier New"/>
-          <w:lang w:val="fr-FR"/>
-        </w:rPr>
-      </w:pPr>
-      <w:r>
-        <w:rPr>
-          <w:rFonts w:ascii="Courier New" w:hAnsi="Courier New" w:cs="Courier New"/>
-          <w:lang w:val="fr-FR"/>
-        </w:rPr>
-        <w:t xml:space="preserve">    </w:t>
-      </w:r>
-      <w:proofErr w:type="gramStart"/>
-      <w:r>
-        <w:rPr>
-          <w:rFonts w:ascii="Courier New" w:hAnsi="Courier New" w:cs="Courier New"/>
-          <w:lang w:val="fr-FR"/>
-        </w:rPr>
-        <w:t>uint</w:t>
-      </w:r>
-      <w:proofErr w:type="gramEnd"/>
-      <w:r>
-        <w:rPr>
-          <w:rFonts w:ascii="Courier New" w:hAnsi="Courier New" w:cs="Courier New"/>
-          <w:lang w:val="fr-FR"/>
-        </w:rPr>
-        <w:t>8_t Pres_Brk_</w:t>
-      </w:r>
-      <w:proofErr w:type="gramStart"/>
-      <w:r>
-        <w:rPr>
-          <w:rFonts w:ascii="Courier New" w:hAnsi="Courier New" w:cs="Courier New"/>
-          <w:lang w:val="fr-FR"/>
-        </w:rPr>
-        <w:t>Front;</w:t>
-      </w:r>
-      <w:proofErr w:type="gramEnd"/>
+        <w:t>    uint8_t Pres_Brk_Front;</w:t>
+      </w:r>
     </w:p>
     <w:p>
       <w:pPr>
@@ -1708,23 +1624,7 @@
           <w:rFonts w:ascii="Courier New" w:hAnsi="Courier New" w:cs="Courier New"/>
           <w:lang w:val="en-US"/>
         </w:rPr>
-        <w:t xml:space="preserve">void </w:t>
-      </w:r>
-      <w:proofErr w:type="gramStart"/>
-      <w:r>
-        <w:rPr>
-          <w:rFonts w:ascii="Courier New" w:hAnsi="Courier New" w:cs="Courier New"/>
-          <w:lang w:val="en-US"/>
-        </w:rPr>
-        <w:t>CanRecv(</w:t>
-      </w:r>
-      <w:proofErr w:type="gramEnd"/>
-      <w:r>
-        <w:rPr>
-          <w:rFonts w:ascii="Courier New" w:hAnsi="Courier New" w:cs="Courier New"/>
-          <w:lang w:val="en-US"/>
-        </w:rPr>
-        <w:t>void *args)</w:t>
+        <w:t>void CanRecv(void *args)</w:t>
       </w:r>
     </w:p>
     <w:p>
@@ -1772,23 +1672,7 @@
           <w:rFonts w:ascii="Courier New" w:hAnsi="Courier New" w:cs="Courier New"/>
           <w:lang w:val="en-US"/>
         </w:rPr>
-        <w:t xml:space="preserve">  uint8_t </w:t>
-      </w:r>
-      <w:proofErr w:type="gramStart"/>
-      <w:r>
-        <w:rPr>
-          <w:rFonts w:ascii="Courier New" w:hAnsi="Courier New" w:cs="Courier New"/>
-          <w:lang w:val="en-US"/>
-        </w:rPr>
-        <w:t>data[</w:t>
-      </w:r>
-      <w:proofErr w:type="gramEnd"/>
-      <w:r>
-        <w:rPr>
-          <w:rFonts w:ascii="Courier New" w:hAnsi="Courier New" w:cs="Courier New"/>
-          <w:lang w:val="en-US"/>
-        </w:rPr>
-        <w:t>64];</w:t>
+        <w:t>  uint8_t data[64];</w:t>
       </w:r>
     </w:p>
     <w:p>
@@ -1836,64 +1720,32 @@
           <w:rFonts w:ascii="Courier New" w:hAnsi="Courier New" w:cs="Courier New"/>
           <w:lang w:val="en-US"/>
         </w:rPr>
-        <w:t xml:space="preserve">  uint32_t tick = </w:t>
-      </w:r>
-      <w:proofErr w:type="gramStart"/>
-      <w:r>
-        <w:rPr>
-          <w:rFonts w:ascii="Courier New" w:hAnsi="Courier New" w:cs="Courier New"/>
-          <w:lang w:val="en-US"/>
-        </w:rPr>
-        <w:t>osKernelGetTickCount(</w:t>
-      </w:r>
-      <w:proofErr w:type="gramEnd"/>
-      <w:r>
-        <w:rPr>
-          <w:rFonts w:ascii="Courier New" w:hAnsi="Courier New" w:cs="Courier New"/>
-          <w:lang w:val="en-US"/>
-        </w:rPr>
-        <w:t>);</w:t>
-      </w:r>
-    </w:p>
-    <w:p>
-      <w:pPr>
-        <w:spacing w:after="0"/>
-        <w:rPr>
-          <w:rFonts w:ascii="Courier New" w:hAnsi="Courier New" w:cs="Courier New"/>
-          <w:lang w:val="en-US"/>
-        </w:rPr>
-      </w:pPr>
-    </w:p>
-    <w:p>
-      <w:pPr>
-        <w:spacing w:after="0"/>
-        <w:rPr>
-          <w:rFonts w:ascii="Courier New" w:hAnsi="Courier New" w:cs="Courier New"/>
-          <w:lang w:val="en-US"/>
-        </w:rPr>
-      </w:pPr>
-      <w:r>
-        <w:rPr>
-          <w:rFonts w:ascii="Courier New" w:hAnsi="Courier New" w:cs="Courier New"/>
-          <w:lang w:val="en-US"/>
-        </w:rPr>
-        <w:t xml:space="preserve">  </w:t>
-      </w:r>
-      <w:proofErr w:type="gramStart"/>
-      <w:r>
-        <w:rPr>
-          <w:rFonts w:ascii="Courier New" w:hAnsi="Courier New" w:cs="Courier New"/>
-          <w:lang w:val="en-US"/>
-        </w:rPr>
-        <w:t>while(</w:t>
-      </w:r>
-      <w:proofErr w:type="gramEnd"/>
-      <w:r>
-        <w:rPr>
-          <w:rFonts w:ascii="Courier New" w:hAnsi="Courier New" w:cs="Courier New"/>
-          <w:lang w:val="en-US"/>
-        </w:rPr>
-        <w:t>1)</w:t>
+        <w:t>  uint32_t tick = osKernelGetTickCount();</w:t>
+      </w:r>
+    </w:p>
+    <w:p>
+      <w:pPr>
+        <w:spacing w:after="0"/>
+        <w:rPr>
+          <w:rFonts w:ascii="Courier New" w:hAnsi="Courier New" w:cs="Courier New"/>
+          <w:lang w:val="en-US"/>
+        </w:rPr>
+      </w:pPr>
+    </w:p>
+    <w:p>
+      <w:pPr>
+        <w:spacing w:after="0"/>
+        <w:rPr>
+          <w:rFonts w:ascii="Courier New" w:hAnsi="Courier New" w:cs="Courier New"/>
+          <w:lang w:val="en-US"/>
+        </w:rPr>
+      </w:pPr>
+      <w:r>
+        <w:rPr>
+          <w:rFonts w:ascii="Courier New" w:hAnsi="Courier New" w:cs="Courier New"/>
+          <w:lang w:val="en-US"/>
+        </w:rPr>
+        <w:t>  while(1)</w:t>
       </w:r>
     </w:p>
     <w:p>
@@ -1967,23 +1819,7 @@
           <w:rFonts w:ascii="Courier New" w:hAnsi="Courier New" w:cs="Courier New"/>
           <w:lang w:val="en-US"/>
         </w:rPr>
-        <w:t>    while (HAL_FDCAN_</w:t>
-      </w:r>
-      <w:proofErr w:type="gramStart"/>
-      <w:r>
-        <w:rPr>
-          <w:rFonts w:ascii="Courier New" w:hAnsi="Courier New" w:cs="Courier New"/>
-          <w:lang w:val="en-US"/>
-        </w:rPr>
-        <w:t>GetRxFifoFillLevel(</w:t>
-      </w:r>
-      <w:proofErr w:type="gramEnd"/>
-      <w:r>
-        <w:rPr>
-          <w:rFonts w:ascii="Courier New" w:hAnsi="Courier New" w:cs="Courier New"/>
-          <w:lang w:val="en-US"/>
-        </w:rPr>
-        <w:t>&amp;hfdcan1, FDCAN_RX_FIFO0) &gt; 0)</w:t>
+        <w:t>    while (HAL_FDCAN_GetRxFifoFillLevel(&amp;hfdcan1, FDCAN_RX_FIFO0) &gt; 0)</w:t>
       </w:r>
     </w:p>
     <w:p>
@@ -2015,39 +1851,7 @@
           <w:rFonts w:ascii="Courier New" w:hAnsi="Courier New" w:cs="Courier New"/>
           <w:lang w:val="en-US"/>
         </w:rPr>
-        <w:t>      if (HAL_FDCAN_</w:t>
-      </w:r>
-      <w:proofErr w:type="gramStart"/>
-      <w:r>
-        <w:rPr>
-          <w:rFonts w:ascii="Courier New" w:hAnsi="Courier New" w:cs="Courier New"/>
-          <w:lang w:val="en-US"/>
-        </w:rPr>
-        <w:t>GetRxMessage(</w:t>
-      </w:r>
-      <w:proofErr w:type="gramEnd"/>
-      <w:r>
-        <w:rPr>
-          <w:rFonts w:ascii="Courier New" w:hAnsi="Courier New" w:cs="Courier New"/>
-          <w:lang w:val="en-US"/>
-        </w:rPr>
-        <w:t>&amp;hfdcan1, FDCAN_RX_FIFO0, &amp;header, rawMsg.data</w:t>
-      </w:r>
-      <w:proofErr w:type="gramStart"/>
-      <w:r>
-        <w:rPr>
-          <w:rFonts w:ascii="Courier New" w:hAnsi="Courier New" w:cs="Courier New"/>
-          <w:lang w:val="en-US"/>
-        </w:rPr>
-        <w:t>) !</w:t>
-      </w:r>
-      <w:proofErr w:type="gramEnd"/>
-      <w:r>
-        <w:rPr>
-          <w:rFonts w:ascii="Courier New" w:hAnsi="Courier New" w:cs="Courier New"/>
-          <w:lang w:val="en-US"/>
-        </w:rPr>
-        <w:t>= HAL_OK)</w:t>
+        <w:t>      if (HAL_FDCAN_GetRxMessage(&amp;hfdcan1, FDCAN_RX_FIFO0, &amp;header, rawMsg.data) != HAL_OK)</w:t>
       </w:r>
     </w:p>
     <w:p>
@@ -2095,119 +1899,55 @@
           <w:rFonts w:ascii="Courier New" w:hAnsi="Courier New" w:cs="Courier New"/>
           <w:lang w:val="en-US"/>
         </w:rPr>
-        <w:t xml:space="preserve">            rawMsg.id = </w:t>
-      </w:r>
-      <w:proofErr w:type="gramStart"/>
-      <w:r>
-        <w:rPr>
-          <w:rFonts w:ascii="Courier New" w:hAnsi="Courier New" w:cs="Courier New"/>
-          <w:lang w:val="en-US"/>
-        </w:rPr>
-        <w:t>header.Identifier</w:t>
-      </w:r>
-      <w:proofErr w:type="gramEnd"/>
-      <w:r>
-        <w:rPr>
-          <w:rFonts w:ascii="Courier New" w:hAnsi="Courier New" w:cs="Courier New"/>
-          <w:lang w:val="en-US"/>
-        </w:rPr>
-        <w:t>;</w:t>
-      </w:r>
-    </w:p>
-    <w:p>
-      <w:pPr>
-        <w:spacing w:after="0"/>
-        <w:rPr>
-          <w:rFonts w:ascii="Courier New" w:hAnsi="Courier New" w:cs="Courier New"/>
-          <w:lang w:val="en-US"/>
-        </w:rPr>
-      </w:pPr>
-      <w:r>
-        <w:rPr>
-          <w:rFonts w:ascii="Courier New" w:hAnsi="Courier New" w:cs="Courier New"/>
-          <w:lang w:val="en-US"/>
-        </w:rPr>
-        <w:t xml:space="preserve">            osStatus_t status = </w:t>
-      </w:r>
-      <w:proofErr w:type="gramStart"/>
-      <w:r>
-        <w:rPr>
-          <w:rFonts w:ascii="Courier New" w:hAnsi="Courier New" w:cs="Courier New"/>
-          <w:lang w:val="en-US"/>
-        </w:rPr>
-        <w:t>osMessageQueuePut(</w:t>
-      </w:r>
-      <w:proofErr w:type="gramEnd"/>
-      <w:r>
-        <w:rPr>
-          <w:rFonts w:ascii="Courier New" w:hAnsi="Courier New" w:cs="Courier New"/>
-          <w:lang w:val="en-US"/>
-        </w:rPr>
-        <w:t>guiMQHandle, &amp;rawMsg, 0, 0);</w:t>
-      </w:r>
-    </w:p>
-    <w:p>
-      <w:pPr>
-        <w:spacing w:after="0"/>
-        <w:rPr>
-          <w:rFonts w:ascii="Courier New" w:hAnsi="Courier New" w:cs="Courier New"/>
-          <w:lang w:val="en-US"/>
-        </w:rPr>
-      </w:pPr>
-      <w:r>
-        <w:rPr>
-          <w:rFonts w:ascii="Courier New" w:hAnsi="Courier New" w:cs="Courier New"/>
-          <w:lang w:val="en-US"/>
-        </w:rPr>
-        <w:t xml:space="preserve">            </w:t>
-      </w:r>
-      <w:proofErr w:type="gramStart"/>
-      <w:r>
-        <w:rPr>
-          <w:rFonts w:ascii="Courier New" w:hAnsi="Courier New" w:cs="Courier New"/>
-          <w:lang w:val="en-US"/>
-        </w:rPr>
-        <w:t>if(status !</w:t>
-      </w:r>
-      <w:proofErr w:type="gramEnd"/>
-      <w:r>
-        <w:rPr>
-          <w:rFonts w:ascii="Courier New" w:hAnsi="Courier New" w:cs="Courier New"/>
-          <w:lang w:val="en-US"/>
-        </w:rPr>
-        <w:t>= osOK) {</w:t>
-      </w:r>
-    </w:p>
-    <w:p>
-      <w:pPr>
-        <w:spacing w:after="0"/>
-        <w:rPr>
-          <w:rFonts w:ascii="Courier New" w:hAnsi="Courier New" w:cs="Courier New"/>
-          <w:lang w:val="en-US"/>
-        </w:rPr>
-      </w:pPr>
-      <w:r>
-        <w:rPr>
-          <w:rFonts w:ascii="Courier New" w:hAnsi="Courier New" w:cs="Courier New"/>
-          <w:lang w:val="en-US"/>
-        </w:rPr>
-        <w:t xml:space="preserve">              </w:t>
-      </w:r>
-      <w:proofErr w:type="gramStart"/>
-      <w:r>
-        <w:rPr>
-          <w:rFonts w:ascii="Courier New" w:hAnsi="Courier New" w:cs="Courier New"/>
-          <w:lang w:val="en-US"/>
-        </w:rPr>
-        <w:t>SafeQueuePut(</w:t>
-      </w:r>
-      <w:proofErr w:type="gramEnd"/>
-      <w:r>
-        <w:rPr>
-          <w:rFonts w:ascii="Courier New" w:hAnsi="Courier New" w:cs="Courier New"/>
-          <w:lang w:val="en-US"/>
-        </w:rPr>
-        <w:t>rawMsg.data);</w:t>
+        <w:t>            rawMsg.id = header.Identifier;</w:t>
+      </w:r>
+    </w:p>
+    <w:p>
+      <w:pPr>
+        <w:spacing w:after="0"/>
+        <w:rPr>
+          <w:rFonts w:ascii="Courier New" w:hAnsi="Courier New" w:cs="Courier New"/>
+          <w:lang w:val="en-US"/>
+        </w:rPr>
+      </w:pPr>
+      <w:r>
+        <w:rPr>
+          <w:rFonts w:ascii="Courier New" w:hAnsi="Courier New" w:cs="Courier New"/>
+          <w:lang w:val="en-US"/>
+        </w:rPr>
+        <w:t>            osStatus_t status = osMessageQueuePut(guiMQHandle, &amp;rawMsg, 0, 0);</w:t>
+      </w:r>
+    </w:p>
+    <w:p>
+      <w:pPr>
+        <w:spacing w:after="0"/>
+        <w:rPr>
+          <w:rFonts w:ascii="Courier New" w:hAnsi="Courier New" w:cs="Courier New"/>
+          <w:lang w:val="en-US"/>
+        </w:rPr>
+      </w:pPr>
+      <w:r>
+        <w:rPr>
+          <w:rFonts w:ascii="Courier New" w:hAnsi="Courier New" w:cs="Courier New"/>
+          <w:lang w:val="en-US"/>
+        </w:rPr>
+        <w:t>            if(status != osOK) {</w:t>
+      </w:r>
+    </w:p>
+    <w:p>
+      <w:pPr>
+        <w:spacing w:after="0"/>
+        <w:rPr>
+          <w:rFonts w:ascii="Courier New" w:hAnsi="Courier New" w:cs="Courier New"/>
+          <w:lang w:val="en-US"/>
+        </w:rPr>
+      </w:pPr>
+      <w:r>
+        <w:rPr>
+          <w:rFonts w:ascii="Courier New" w:hAnsi="Courier New" w:cs="Courier New"/>
+          <w:lang w:val="en-US"/>
+        </w:rPr>
+        <w:t>              SafeQueuePut(rawMsg.data);</w:t>
       </w:r>
     </w:p>
     <w:p>
@@ -2255,71 +1995,23 @@
           <w:rFonts w:ascii="Courier New" w:hAnsi="Courier New" w:cs="Courier New"/>
           <w:lang w:val="en-US"/>
         </w:rPr>
-        <w:t>    if (HAL_FDCAN_</w:t>
-      </w:r>
-      <w:proofErr w:type="gramStart"/>
-      <w:r>
-        <w:rPr>
-          <w:rFonts w:ascii="Courier New" w:hAnsi="Courier New" w:cs="Courier New"/>
-          <w:lang w:val="en-US"/>
-        </w:rPr>
-        <w:t>GetRxFifoFillLevel(</w:t>
-      </w:r>
-      <w:proofErr w:type="gramEnd"/>
-      <w:r>
-        <w:rPr>
-          <w:rFonts w:ascii="Courier New" w:hAnsi="Courier New" w:cs="Courier New"/>
-          <w:lang w:val="en-US"/>
-        </w:rPr>
-        <w:t>&amp;hfdcan1, FDCAN_RX_FIFO0) &gt; 0) {</w:t>
-      </w:r>
-    </w:p>
-    <w:p>
-      <w:pPr>
-        <w:spacing w:after="0"/>
-        <w:rPr>
-          <w:rFonts w:ascii="Courier New" w:hAnsi="Courier New" w:cs="Courier New"/>
-          <w:lang w:val="en-US"/>
-        </w:rPr>
-      </w:pPr>
-      <w:r>
-        <w:rPr>
-          <w:rFonts w:ascii="Courier New" w:hAnsi="Courier New" w:cs="Courier New"/>
-          <w:lang w:val="en-US"/>
-        </w:rPr>
-        <w:t xml:space="preserve">        </w:t>
-      </w:r>
-      <w:proofErr w:type="gramStart"/>
-      <w:r>
-        <w:rPr>
-          <w:rFonts w:ascii="Courier New" w:hAnsi="Courier New" w:cs="Courier New"/>
-          <w:lang w:val="en-US"/>
-        </w:rPr>
-        <w:t>osDelay(</w:t>
-      </w:r>
-      <w:proofErr w:type="gramEnd"/>
-      <w:r>
-        <w:rPr>
-          <w:rFonts w:ascii="Courier New" w:hAnsi="Courier New" w:cs="Courier New"/>
-          <w:lang w:val="en-US"/>
-        </w:rPr>
-        <w:t>1</w:t>
-      </w:r>
-      <w:proofErr w:type="gramStart"/>
-      <w:r>
-        <w:rPr>
-          <w:rFonts w:ascii="Courier New" w:hAnsi="Courier New" w:cs="Courier New"/>
-          <w:lang w:val="en-US"/>
-        </w:rPr>
-        <w:t xml:space="preserve">);   </w:t>
-      </w:r>
-      <w:proofErr w:type="gramEnd"/>
-      <w:r>
-        <w:rPr>
-          <w:rFonts w:ascii="Courier New" w:hAnsi="Courier New" w:cs="Courier New"/>
-          <w:lang w:val="en-US"/>
-        </w:rPr>
-        <w:t>// give time back deterministically</w:t>
+        <w:t>    if (HAL_FDCAN_GetRxFifoFillLevel(&amp;hfdcan1, FDCAN_RX_FIFO0) &gt; 0) {</w:t>
+      </w:r>
+    </w:p>
+    <w:p>
+      <w:pPr>
+        <w:spacing w:after="0"/>
+        <w:rPr>
+          <w:rFonts w:ascii="Courier New" w:hAnsi="Courier New" w:cs="Courier New"/>
+          <w:lang w:val="en-US"/>
+        </w:rPr>
+      </w:pPr>
+      <w:r>
+        <w:rPr>
+          <w:rFonts w:ascii="Courier New" w:hAnsi="Courier New" w:cs="Courier New"/>
+          <w:lang w:val="en-US"/>
+        </w:rPr>
+        <w:t>        osDelay(1);   // give time back deterministically</w:t>
       </w:r>
     </w:p>
     <w:p>
@@ -2390,95 +2082,93 @@
         </w:rPr>
         <w:t>The receiver task is a periodic task. The period is controlled by making the task sleep for 100ms before it wakes. After the task wakes, it enqueues the message in the receiver message queue (</w:t>
       </w:r>
-      <w:proofErr w:type="gramStart"/>
       <w:r>
         <w:rPr>
           <w:rFonts w:cs="Courier New"/>
           <w:lang w:val="en-US"/>
         </w:rPr>
-        <w:t>osMessageQueuePut(</w:t>
-      </w:r>
-      <w:proofErr w:type="gramEnd"/>
+        <w:t xml:space="preserve">osMessageQueuePut(guiMQHandle, &amp;rawMsg, 0, 0)) </w:t>
+      </w:r>
+      <w:r>
+        <w:rPr>
+          <w:rFonts w:cs="Calibri"/>
+          <w:lang w:val="en-US"/>
+        </w:rPr>
+        <w:t>that we configured in the previous steps. The task then goes back to sleep and this keeps on repeating. This is the end of the road for the back end.</w:t>
+      </w:r>
+    </w:p>
+    <w:p>
+      <w:pPr>
+        <w:rPr>
+          <w:rFonts w:cs="Calibri"/>
+          <w:lang w:val="en-US"/>
+        </w:rPr>
+      </w:pPr>
+      <w:r>
+        <w:rPr>
+          <w:rFonts w:cs="Calibri"/>
+          <w:lang w:val="en-US"/>
+        </w:rPr>
+        <w:t>Now, if the CAN ID 0x10000009 is being transmitted over the CAN, the receiver will catch it and make it available to the system. We can keep on adding new signals in the form of a struct as shown above. Make sure to give meaningful names to the fields and the CAN ID.</w:t>
+      </w:r>
+    </w:p>
+    <w:p>
+      <w:pPr>
+        <w:pStyle w:val="Heading2"/>
+        <w:rPr>
+          <w:rFonts w:ascii="Calibri" w:hAnsi="Calibri" w:cs="Calibri"/>
+          <w:lang w:val="en-US"/>
+        </w:rPr>
+      </w:pPr>
+      <w:r>
+        <w:rPr>
+          <w:rFonts w:ascii="Calibri" w:hAnsi="Calibri" w:cs="Calibri"/>
+          <w:lang w:val="en-US"/>
+        </w:rPr>
+        <w:t>Forwarding</w:t>
+      </w:r>
+      <w:r>
+        <w:rPr>
+          <w:rFonts w:ascii="Calibri" w:hAnsi="Calibri" w:cs="Calibri"/>
+          <w:lang w:val="en-US"/>
+        </w:rPr>
+        <w:t xml:space="preserve"> CAN data to the display</w:t>
+      </w:r>
+    </w:p>
+    <w:p>
+      <w:pPr>
+        <w:rPr>
+          <w:rFonts w:cs="Calibri"/>
+          <w:lang w:val="en-US"/>
+        </w:rPr>
+      </w:pPr>
+      <w:r>
+        <w:rPr>
+          <w:rFonts w:cs="Calibri"/>
+          <w:lang w:val="en-US"/>
+        </w:rPr>
+        <w:t xml:space="preserve">As previously stated, the Model is responsible for collecting data from the RTOS and make it available for the display. </w:t>
+      </w:r>
+      <w:r>
+        <w:rPr>
+          <w:rFonts w:cs="Calibri"/>
+          <w:lang w:val="en-US"/>
+        </w:rPr>
+        <w:t xml:space="preserve">As shown above in the </w:t>
+      </w:r>
+      <w:r>
+        <w:rPr>
+          <w:rFonts w:ascii="Courier New" w:hAnsi="Courier New" w:cs="Courier New"/>
+          <w:lang w:val="en-US"/>
+        </w:rPr>
+        <w:t>CanRecv</w:t>
+      </w:r>
       <w:r>
         <w:rPr>
           <w:rFonts w:cs="Courier New"/>
           <w:lang w:val="en-US"/>
         </w:rPr>
-        <w:t xml:space="preserve">guiMQHandle, &amp;rawMsg, 0, 0)) </w:t>
-      </w:r>
-      <w:r>
-        <w:rPr>
-          <w:rFonts w:cs="Calibri"/>
-          <w:lang w:val="en-US"/>
-        </w:rPr>
-        <w:t>that we configured in the previous steps. The task then goes back to sleep and this keeps on repeating. This is the end of the road for the back end.</w:t>
-      </w:r>
-    </w:p>
-    <w:p>
-      <w:pPr>
-        <w:rPr>
-          <w:rFonts w:cs="Calibri"/>
-          <w:lang w:val="en-US"/>
-        </w:rPr>
-      </w:pPr>
-      <w:r>
-        <w:rPr>
-          <w:rFonts w:cs="Calibri"/>
-          <w:lang w:val="en-US"/>
-        </w:rPr>
-        <w:t>Now, if the CAN ID 0x10000009 is being transmitted over the CAN, the receiver will catch it and make it available to the system. We can keep on adding new signals in the form of a struct as shown above. Make sure to give meaningful names to the fields and the CAN ID.</w:t>
-      </w:r>
-    </w:p>
-    <w:p>
-      <w:pPr>
-        <w:pStyle w:val="Heading2"/>
-        <w:rPr>
-          <w:rFonts w:ascii="Calibri" w:hAnsi="Calibri" w:cs="Calibri"/>
-          <w:lang w:val="en-US"/>
-        </w:rPr>
-      </w:pPr>
-      <w:r>
-        <w:rPr>
-          <w:rFonts w:ascii="Calibri" w:hAnsi="Calibri" w:cs="Calibri"/>
-          <w:lang w:val="en-US"/>
-        </w:rPr>
-        <w:t>Forwarding</w:t>
-      </w:r>
-      <w:r>
-        <w:rPr>
-          <w:rFonts w:ascii="Calibri" w:hAnsi="Calibri" w:cs="Calibri"/>
-          <w:lang w:val="en-US"/>
-        </w:rPr>
-        <w:t xml:space="preserve"> CAN data to the display</w:t>
-      </w:r>
-    </w:p>
-    <w:p>
-      <w:pPr>
-        <w:rPr>
-          <w:rFonts w:cs="Calibri"/>
-          <w:lang w:val="en-US"/>
-        </w:rPr>
-      </w:pPr>
-      <w:r>
-        <w:rPr>
-          <w:rFonts w:cs="Calibri"/>
-          <w:lang w:val="en-US"/>
-        </w:rPr>
-        <w:t xml:space="preserve">As previously stated, the Model is responsible for collecting data from the RTOS and make it available for the display. </w:t>
-      </w:r>
-      <w:r>
-        <w:rPr>
-          <w:rFonts w:cs="Calibri"/>
-          <w:lang w:val="en-US"/>
-        </w:rPr>
-        <w:t xml:space="preserve">As shown above in the </w:t>
-      </w:r>
-      <w:r>
-        <w:rPr>
-          <w:rFonts w:cs="Courier New"/>
-          <w:lang w:val="en-US"/>
-        </w:rPr>
-        <w:t xml:space="preserve">CanRecv </w:t>
+        <w:t xml:space="preserve"> </w:t>
       </w:r>
       <w:r>
         <w:rPr>
@@ -2797,64 +2487,32 @@
           <w:rFonts w:ascii="Courier New" w:hAnsi="Courier New" w:cs="Courier New"/>
           <w:lang w:val="en-US"/>
         </w:rPr>
-        <w:t xml:space="preserve">    </w:t>
-      </w:r>
-      <w:proofErr w:type="gramStart"/>
-      <w:r>
-        <w:rPr>
-          <w:rFonts w:ascii="Courier New" w:hAnsi="Courier New" w:cs="Courier New"/>
-          <w:lang w:val="en-US"/>
-        </w:rPr>
-        <w:t>Model(</w:t>
-      </w:r>
-      <w:proofErr w:type="gramEnd"/>
-      <w:r>
-        <w:rPr>
-          <w:rFonts w:ascii="Courier New" w:hAnsi="Courier New" w:cs="Courier New"/>
-          <w:lang w:val="en-US"/>
-        </w:rPr>
-        <w:t>);</w:t>
-      </w:r>
-    </w:p>
-    <w:p>
-      <w:pPr>
-        <w:spacing w:after="0"/>
-        <w:rPr>
-          <w:rFonts w:ascii="Courier New" w:hAnsi="Courier New" w:cs="Courier New"/>
-          <w:lang w:val="en-US"/>
-        </w:rPr>
-      </w:pPr>
-    </w:p>
-    <w:p>
-      <w:pPr>
-        <w:spacing w:after="0"/>
-        <w:rPr>
-          <w:rFonts w:ascii="Courier New" w:hAnsi="Courier New" w:cs="Courier New"/>
-          <w:lang w:val="en-US"/>
-        </w:rPr>
-      </w:pPr>
-      <w:r>
-        <w:rPr>
-          <w:rFonts w:ascii="Courier New" w:hAnsi="Courier New" w:cs="Courier New"/>
-          <w:lang w:val="en-US"/>
-        </w:rPr>
-        <w:t xml:space="preserve">    void </w:t>
-      </w:r>
-      <w:proofErr w:type="gramStart"/>
-      <w:r>
-        <w:rPr>
-          <w:rFonts w:ascii="Courier New" w:hAnsi="Courier New" w:cs="Courier New"/>
-          <w:lang w:val="en-US"/>
-        </w:rPr>
-        <w:t>bind(</w:t>
-      </w:r>
-      <w:proofErr w:type="gramEnd"/>
-      <w:r>
-        <w:rPr>
-          <w:rFonts w:ascii="Courier New" w:hAnsi="Courier New" w:cs="Courier New"/>
-          <w:lang w:val="en-US"/>
-        </w:rPr>
-        <w:t>ModelListener* listener)</w:t>
+        <w:t>    Model();</w:t>
+      </w:r>
+    </w:p>
+    <w:p>
+      <w:pPr>
+        <w:spacing w:after="0"/>
+        <w:rPr>
+          <w:rFonts w:ascii="Courier New" w:hAnsi="Courier New" w:cs="Courier New"/>
+          <w:lang w:val="en-US"/>
+        </w:rPr>
+      </w:pPr>
+    </w:p>
+    <w:p>
+      <w:pPr>
+        <w:spacing w:after="0"/>
+        <w:rPr>
+          <w:rFonts w:ascii="Courier New" w:hAnsi="Courier New" w:cs="Courier New"/>
+          <w:lang w:val="en-US"/>
+        </w:rPr>
+      </w:pPr>
+      <w:r>
+        <w:rPr>
+          <w:rFonts w:ascii="Courier New" w:hAnsi="Courier New" w:cs="Courier New"/>
+          <w:lang w:val="en-US"/>
+        </w:rPr>
+        <w:t>    void bind(ModelListener* listener)</w:t>
       </w:r>
     </w:p>
     <w:p>
@@ -2927,23 +2585,7 @@
           <w:rFonts w:ascii="Courier New" w:hAnsi="Courier New" w:cs="Courier New"/>
           <w:lang w:val="en-US"/>
         </w:rPr>
-        <w:t xml:space="preserve">    void </w:t>
-      </w:r>
-      <w:proofErr w:type="gramStart"/>
-      <w:r>
-        <w:rPr>
-          <w:rFonts w:ascii="Courier New" w:hAnsi="Courier New" w:cs="Courier New"/>
-          <w:lang w:val="en-US"/>
-        </w:rPr>
-        <w:t>tick(</w:t>
-      </w:r>
-      <w:proofErr w:type="gramEnd"/>
-      <w:r>
-        <w:rPr>
-          <w:rFonts w:ascii="Courier New" w:hAnsi="Courier New" w:cs="Courier New"/>
-          <w:lang w:val="en-US"/>
-        </w:rPr>
-        <w:t>);</w:t>
+        <w:t>    void tick();</w:t>
       </w:r>
     </w:p>
     <w:p>
@@ -3025,23 +2667,7 @@
           <w:rFonts w:ascii="Courier New" w:hAnsi="Courier New" w:cs="Courier New"/>
           <w:lang w:val="en-US"/>
         </w:rPr>
-        <w:t xml:space="preserve"> bool </w:t>
-      </w:r>
-      <w:proofErr w:type="gramStart"/>
-      <w:r>
-        <w:rPr>
-          <w:rFonts w:ascii="Courier New" w:hAnsi="Courier New" w:cs="Courier New"/>
-          <w:lang w:val="en-US"/>
-        </w:rPr>
-        <w:t>parsePressHydLightPt(</w:t>
-      </w:r>
-      <w:proofErr w:type="gramEnd"/>
-      <w:r>
-        <w:rPr>
-          <w:rFonts w:ascii="Courier New" w:hAnsi="Courier New" w:cs="Courier New"/>
-          <w:lang w:val="en-US"/>
-        </w:rPr>
-        <w:t>CAN_Raw_Msg_t, Press_Hydraulic_Light_PowerTrain_t *);</w:t>
+        <w:t> bool parsePressHydLightPt(CAN_Raw_Msg_t, Press_Hydraulic_Light_PowerTrain_t *);</w:t>
       </w:r>
     </w:p>
     <w:p>
@@ -3149,19 +2775,19 @@
           <w:szCs w:val="22"/>
           <w:lang w:val="en-US"/>
         </w:rPr>
-        <w:t xml:space="preserve">void </w:t>
-      </w:r>
-      <w:proofErr w:type="gramStart"/>
-      <w:r>
+        <w:t>void Model::tick()</w:t>
+      </w:r>
+    </w:p>
+    <w:p>
+      <w:pPr>
+        <w:spacing w:after="0"/>
         <w:rPr>
           <w:rFonts w:ascii="Courier New" w:hAnsi="Courier New" w:cs="Courier New"/>
           <w:sz w:val="22"/>
           <w:szCs w:val="22"/>
           <w:lang w:val="en-US"/>
         </w:rPr>
-        <w:t>Model::tick(</w:t>
-      </w:r>
-      <w:proofErr w:type="gramEnd"/>
+      </w:pPr>
       <w:r>
         <w:rPr>
           <w:rFonts w:ascii="Courier New" w:hAnsi="Courier New" w:cs="Courier New"/>
@@ -3169,7 +2795,7 @@
           <w:szCs w:val="22"/>
           <w:lang w:val="en-US"/>
         </w:rPr>
-        <w:t>)</w:t>
+        <w:t>{</w:t>
       </w:r>
     </w:p>
     <w:p>
@@ -3189,7 +2815,7 @@
           <w:szCs w:val="22"/>
           <w:lang w:val="en-US"/>
         </w:rPr>
-        <w:t>{</w:t>
+        <w:t>    CAN_Raw_Msg_t rawMsg;</w:t>
       </w:r>
     </w:p>
     <w:p>
@@ -3202,26 +2828,26 @@
           <w:lang w:val="en-US"/>
         </w:rPr>
       </w:pPr>
-      <w:r>
+    </w:p>
+    <w:p>
+      <w:pPr>
+        <w:spacing w:after="0"/>
         <w:rPr>
           <w:rFonts w:ascii="Courier New" w:hAnsi="Courier New" w:cs="Courier New"/>
           <w:sz w:val="22"/>
           <w:szCs w:val="22"/>
           <w:lang w:val="en-US"/>
         </w:rPr>
-        <w:t>    CAN_Raw_Msg_t rawMsg;</w:t>
-      </w:r>
-    </w:p>
-    <w:p>
-      <w:pPr>
-        <w:spacing w:after="0"/>
+      </w:pPr>
+      <w:r>
         <w:rPr>
           <w:rFonts w:ascii="Courier New" w:hAnsi="Courier New" w:cs="Courier New"/>
           <w:sz w:val="22"/>
           <w:szCs w:val="22"/>
           <w:lang w:val="en-US"/>
         </w:rPr>
-      </w:pPr>
+        <w:t>    uint32_t processed = 10; // to avoid a storm of messages, process in frames</w:t>
+      </w:r>
     </w:p>
     <w:p>
       <w:pPr>
@@ -3233,26 +2859,26 @@
           <w:lang w:val="en-US"/>
         </w:rPr>
       </w:pPr>
-      <w:r>
+    </w:p>
+    <w:p>
+      <w:pPr>
+        <w:spacing w:after="0"/>
         <w:rPr>
           <w:rFonts w:ascii="Courier New" w:hAnsi="Courier New" w:cs="Courier New"/>
           <w:sz w:val="22"/>
           <w:szCs w:val="22"/>
           <w:lang w:val="en-US"/>
         </w:rPr>
-        <w:t>    uint32_t processed = 10; // to avoid a storm of messages, process in frames</w:t>
-      </w:r>
-    </w:p>
-    <w:p>
-      <w:pPr>
-        <w:spacing w:after="0"/>
+      </w:pPr>
+      <w:r>
         <w:rPr>
           <w:rFonts w:ascii="Courier New" w:hAnsi="Courier New" w:cs="Courier New"/>
           <w:sz w:val="22"/>
           <w:szCs w:val="22"/>
           <w:lang w:val="en-US"/>
         </w:rPr>
-      </w:pPr>
+        <w:t>    while(processed &gt; 0 &amp;&amp;</w:t>
+      </w:r>
     </w:p>
     <w:p>
       <w:pPr>
@@ -3271,19 +2897,19 @@
           <w:szCs w:val="22"/>
           <w:lang w:val="en-US"/>
         </w:rPr>
-        <w:t xml:space="preserve">    </w:t>
-      </w:r>
-      <w:proofErr w:type="gramStart"/>
-      <w:r>
+        <w:t>        osMessageQueueGet(guiMQHandle, &amp;rawMsg, 0, 0) == osOK) {</w:t>
+      </w:r>
+    </w:p>
+    <w:p>
+      <w:pPr>
+        <w:spacing w:after="0"/>
         <w:rPr>
           <w:rFonts w:ascii="Courier New" w:hAnsi="Courier New" w:cs="Courier New"/>
           <w:sz w:val="22"/>
           <w:szCs w:val="22"/>
           <w:lang w:val="en-US"/>
         </w:rPr>
-        <w:t>while(</w:t>
-      </w:r>
-      <w:proofErr w:type="gramEnd"/>
+      </w:pPr>
       <w:r>
         <w:rPr>
           <w:rFonts w:ascii="Courier New" w:hAnsi="Courier New" w:cs="Courier New"/>
@@ -3291,7 +2917,7 @@
           <w:szCs w:val="22"/>
           <w:lang w:val="en-US"/>
         </w:rPr>
-        <w:t>processed &gt; 0 &amp;&amp;</w:t>
+        <w:t>        switch(rawMsg.id) {</w:t>
       </w:r>
     </w:p>
     <w:p>
@@ -3311,19 +2937,19 @@
           <w:szCs w:val="22"/>
           <w:lang w:val="en-US"/>
         </w:rPr>
-        <w:t xml:space="preserve">        </w:t>
-      </w:r>
-      <w:proofErr w:type="gramStart"/>
-      <w:r>
+        <w:t>            case CAN_ID_PRESS_HYDRAULIC_LIGHT_POWERTRAIN:</w:t>
+      </w:r>
+    </w:p>
+    <w:p>
+      <w:pPr>
+        <w:spacing w:after="0"/>
         <w:rPr>
           <w:rFonts w:ascii="Courier New" w:hAnsi="Courier New" w:cs="Courier New"/>
           <w:sz w:val="22"/>
           <w:szCs w:val="22"/>
           <w:lang w:val="en-US"/>
         </w:rPr>
-        <w:t>osMessageQueueGet(</w:t>
-      </w:r>
-      <w:proofErr w:type="gramEnd"/>
+      </w:pPr>
       <w:r>
         <w:rPr>
           <w:rFonts w:ascii="Courier New" w:hAnsi="Courier New" w:cs="Courier New"/>
@@ -3331,7 +2957,7 @@
           <w:szCs w:val="22"/>
           <w:lang w:val="en-US"/>
         </w:rPr>
-        <w:t>guiMQHandle, &amp;rawMsg, 0, 0) == osOK) {</w:t>
+        <w:t>                if(parsePressHydLightPt(rawMsg, &amp;phlp))</w:t>
       </w:r>
     </w:p>
     <w:p>
@@ -3351,19 +2977,17 @@
           <w:szCs w:val="22"/>
           <w:lang w:val="en-US"/>
         </w:rPr>
-        <w:t>        switch(rawMsg.id) {</w:t>
-      </w:r>
-    </w:p>
-    <w:p>
-      <w:pPr>
-        <w:spacing w:after="0"/>
+        <w:t>                    modelListener-</w:t>
+      </w:r>
+      <w:r>
         <w:rPr>
           <w:rFonts w:ascii="Courier New" w:hAnsi="Courier New" w:cs="Courier New"/>
           <w:sz w:val="22"/>
           <w:szCs w:val="22"/>
           <w:lang w:val="en-US"/>
         </w:rPr>
-      </w:pPr>
+        <w:t>&gt;</w:t>
+      </w:r>
       <w:r>
         <w:rPr>
           <w:rFonts w:ascii="Courier New" w:hAnsi="Courier New" w:cs="Courier New"/>
@@ -3371,7 +2995,7 @@
           <w:szCs w:val="22"/>
           <w:lang w:val="en-US"/>
         </w:rPr>
-        <w:t>            case CAN_ID_PRESS_HYDRAULIC_LIGHT_POWERTRAIN:</w:t>
+        <w:t>updatePressHydLightPt(phlp);</w:t>
       </w:r>
     </w:p>
     <w:p>
@@ -3391,19 +3015,19 @@
           <w:szCs w:val="22"/>
           <w:lang w:val="en-US"/>
         </w:rPr>
-        <w:t xml:space="preserve">                </w:t>
-      </w:r>
-      <w:proofErr w:type="gramStart"/>
-      <w:r>
+        <w:t>            break;</w:t>
+      </w:r>
+    </w:p>
+    <w:p>
+      <w:pPr>
+        <w:spacing w:after="0"/>
         <w:rPr>
           <w:rFonts w:ascii="Courier New" w:hAnsi="Courier New" w:cs="Courier New"/>
           <w:sz w:val="22"/>
           <w:szCs w:val="22"/>
           <w:lang w:val="en-US"/>
         </w:rPr>
-        <w:t>if(parsePressHydLightPt(</w:t>
-      </w:r>
-      <w:proofErr w:type="gramEnd"/>
+      </w:pPr>
       <w:r>
         <w:rPr>
           <w:rFonts w:ascii="Courier New" w:hAnsi="Courier New" w:cs="Courier New"/>
@@ -3411,28 +3035,28 @@
           <w:szCs w:val="22"/>
           <w:lang w:val="en-US"/>
         </w:rPr>
-        <w:t>rawMsg, &amp;phlp))</w:t>
-      </w:r>
-    </w:p>
-    <w:p>
-      <w:pPr>
-        <w:spacing w:after="0"/>
+        <w:t xml:space="preserve">        </w:t>
+      </w:r>
+      <w:r>
         <w:rPr>
           <w:rFonts w:ascii="Courier New" w:hAnsi="Courier New" w:cs="Courier New"/>
           <w:sz w:val="22"/>
           <w:szCs w:val="22"/>
           <w:lang w:val="en-US"/>
         </w:rPr>
-      </w:pPr>
-      <w:r>
+        <w:t>}</w:t>
+      </w:r>
+    </w:p>
+    <w:p>
+      <w:pPr>
+        <w:spacing w:after="0"/>
         <w:rPr>
           <w:rFonts w:ascii="Courier New" w:hAnsi="Courier New" w:cs="Courier New"/>
           <w:sz w:val="22"/>
           <w:szCs w:val="22"/>
           <w:lang w:val="en-US"/>
         </w:rPr>
-        <w:t>                    modelListener-</w:t>
-      </w:r>
+      </w:pPr>
       <w:r>
         <w:rPr>
           <w:rFonts w:ascii="Courier New" w:hAnsi="Courier New" w:cs="Courier New"/>
@@ -3440,53 +3064,556 @@
           <w:szCs w:val="22"/>
           <w:lang w:val="en-US"/>
         </w:rPr>
-        <w:t>&gt;</w:t>
-      </w:r>
-      <w:r>
+        <w:t>        processed--;</w:t>
+      </w:r>
+    </w:p>
+    <w:p>
+      <w:pPr>
+        <w:spacing w:after="0"/>
         <w:rPr>
           <w:rFonts w:ascii="Courier New" w:hAnsi="Courier New" w:cs="Courier New"/>
           <w:sz w:val="22"/>
           <w:szCs w:val="22"/>
           <w:lang w:val="en-US"/>
         </w:rPr>
-        <w:t>updatePressHydLightPt(phlp);</w:t>
-      </w:r>
-    </w:p>
-    <w:p>
-      <w:pPr>
-        <w:spacing w:after="0"/>
+      </w:pPr>
+      <w:r>
         <w:rPr>
           <w:rFonts w:ascii="Courier New" w:hAnsi="Courier New" w:cs="Courier New"/>
           <w:sz w:val="22"/>
           <w:szCs w:val="22"/>
           <w:lang w:val="en-US"/>
         </w:rPr>
-      </w:pPr>
-      <w:r>
+        <w:t>    }</w:t>
+      </w:r>
+    </w:p>
+    <w:p>
+      <w:pPr>
         <w:rPr>
           <w:rFonts w:ascii="Courier New" w:hAnsi="Courier New" w:cs="Courier New"/>
           <w:sz w:val="22"/>
           <w:szCs w:val="22"/>
           <w:lang w:val="en-US"/>
         </w:rPr>
-        <w:t>            break;</w:t>
-      </w:r>
-    </w:p>
-    <w:p>
-      <w:pPr>
-        <w:spacing w:after="0"/>
+      </w:pPr>
+      <w:r>
         <w:rPr>
           <w:rFonts w:ascii="Courier New" w:hAnsi="Courier New" w:cs="Courier New"/>
           <w:sz w:val="22"/>
           <w:szCs w:val="22"/>
           <w:lang w:val="en-US"/>
         </w:rPr>
-      </w:pPr>
-      <w:r>
-        <w:rPr>
-          <w:rFonts w:ascii="Courier New" w:hAnsi="Courier New" w:cs="Courier New"/>
-          <w:sz w:val="22"/>
-          <w:szCs w:val="22"/>
+        <w:t>}</w:t>
+      </w:r>
+    </w:p>
+    <w:p>
+      <w:pPr>
+        <w:rPr>
+          <w:rFonts w:cs="Calibri"/>
+          <w:lang w:val="en-US"/>
+        </w:rPr>
+      </w:pPr>
+      <w:r>
+        <w:rPr>
+          <w:rFonts w:cs="Calibri"/>
+          <w:lang w:val="en-US"/>
+        </w:rPr>
+        <w:t>We implement the Model’s tick function that runs periodically and get the data from the receiver message queue (</w:t>
+      </w:r>
+      <w:r>
+        <w:rPr>
+          <w:rFonts w:cs="Courier New"/>
+          <w:lang w:val="en-US"/>
+        </w:rPr>
+        <w:t>osMessageQueueGet(guiMQHandle, &amp;rawMsg, 0, 0)</w:t>
+      </w:r>
+      <w:r>
+        <w:rPr>
+          <w:rFonts w:cs="Calibri"/>
+          <w:lang w:val="en-US"/>
+        </w:rPr>
+        <w:t>). Based on the message ID, we switch to a specific parser, which in this case, is the parser for processing the CAN ID 0x10000009.</w:t>
+      </w:r>
+      <w:r>
+        <w:rPr>
+          <w:rFonts w:cs="Calibri"/>
+          <w:lang w:val="en-US"/>
+        </w:rPr>
+        <w:t xml:space="preserve"> </w:t>
+      </w:r>
+    </w:p>
+    <w:p>
+      <w:pPr>
+        <w:spacing w:after="0"/>
+        <w:rPr>
+          <w:rFonts w:ascii="Courier New" w:hAnsi="Courier New" w:cs="Courier New"/>
+          <w:lang w:val="en-US"/>
+        </w:rPr>
+      </w:pPr>
+      <w:r>
+        <w:rPr>
+          <w:rFonts w:ascii="Courier New" w:hAnsi="Courier New" w:cs="Courier New"/>
+          <w:lang w:val="en-US"/>
+        </w:rPr>
+        <w:t>bool Model::parsePressHydLightPt(CAN_Raw_Msg_t rawMsg, Press_Hydraulic_Light_PowerTrain_t *_phlp) {</w:t>
+      </w:r>
+    </w:p>
+    <w:p>
+      <w:pPr>
+        <w:spacing w:after="0"/>
+        <w:rPr>
+          <w:rFonts w:ascii="Courier New" w:hAnsi="Courier New" w:cs="Courier New"/>
+          <w:lang w:val="en-US"/>
+        </w:rPr>
+      </w:pPr>
+      <w:r>
+        <w:rPr>
+          <w:rFonts w:ascii="Courier New" w:hAnsi="Courier New" w:cs="Courier New"/>
+          <w:lang w:val="en-US"/>
+        </w:rPr>
+        <w:t>    uint64_t rawVal;</w:t>
+      </w:r>
+    </w:p>
+    <w:p>
+      <w:pPr>
+        <w:spacing w:after="0"/>
+        <w:rPr>
+          <w:rFonts w:ascii="Courier New" w:hAnsi="Courier New" w:cs="Courier New"/>
+          <w:lang w:val="en-US"/>
+        </w:rPr>
+      </w:pPr>
+      <w:r>
+        <w:rPr>
+          <w:rFonts w:ascii="Courier New" w:hAnsi="Courier New" w:cs="Courier New"/>
+          <w:lang w:val="en-US"/>
+        </w:rPr>
+        <w:t>    bool changed = false;</w:t>
+      </w:r>
+    </w:p>
+    <w:p>
+      <w:pPr>
+        <w:spacing w:after="0"/>
+        <w:rPr>
+          <w:rFonts w:ascii="Courier New" w:hAnsi="Courier New" w:cs="Courier New"/>
+          <w:lang w:val="en-US"/>
+        </w:rPr>
+      </w:pPr>
+      <w:r>
+        <w:rPr>
+          <w:rFonts w:ascii="Courier New" w:hAnsi="Courier New" w:cs="Courier New"/>
+          <w:lang w:val="en-US"/>
+        </w:rPr>
+        <w:t>    float rawFloat;</w:t>
+      </w:r>
+    </w:p>
+    <w:p>
+      <w:pPr>
+        <w:spacing w:after="0"/>
+        <w:rPr>
+          <w:rFonts w:ascii="Courier New" w:hAnsi="Courier New" w:cs="Courier New"/>
+          <w:lang w:val="en-US"/>
+        </w:rPr>
+      </w:pPr>
+    </w:p>
+    <w:p>
+      <w:pPr>
+        <w:spacing w:after="0"/>
+        <w:rPr>
+          <w:rFonts w:ascii="Courier New" w:hAnsi="Courier New" w:cs="Courier New"/>
+          <w:lang w:val="en-US"/>
+        </w:rPr>
+      </w:pPr>
+      <w:r>
+        <w:rPr>
+          <w:rFonts w:ascii="Courier New" w:hAnsi="Courier New" w:cs="Courier New"/>
+          <w:lang w:val="en-US"/>
+        </w:rPr>
+        <w:t>    rawVal = UnpackSignal(rawMsg.data, 0, 5);</w:t>
+      </w:r>
+    </w:p>
+    <w:p>
+      <w:pPr>
+        <w:spacing w:after="0"/>
+        <w:rPr>
+          <w:rFonts w:ascii="Courier New" w:hAnsi="Courier New" w:cs="Courier New"/>
+          <w:lang w:val="en-US"/>
+        </w:rPr>
+      </w:pPr>
+      <w:r>
+        <w:rPr>
+          <w:rFonts w:ascii="Courier New" w:hAnsi="Courier New" w:cs="Courier New"/>
+          <w:lang w:val="en-US"/>
+        </w:rPr>
+        <w:t>    if(_phlp-&gt;Pres_Susp_Front != rawVal) {</w:t>
+      </w:r>
+    </w:p>
+    <w:p>
+      <w:pPr>
+        <w:spacing w:after="0"/>
+        <w:rPr>
+          <w:rFonts w:ascii="Courier New" w:hAnsi="Courier New" w:cs="Courier New"/>
+          <w:lang w:val="en-US"/>
+        </w:rPr>
+      </w:pPr>
+      <w:r>
+        <w:rPr>
+          <w:rFonts w:ascii="Courier New" w:hAnsi="Courier New" w:cs="Courier New"/>
+          <w:lang w:val="en-US"/>
+        </w:rPr>
+        <w:t>        _phlp-&gt;Pres_Susp_Front = rawVal;</w:t>
+      </w:r>
+    </w:p>
+    <w:p>
+      <w:pPr>
+        <w:spacing w:after="0"/>
+        <w:rPr>
+          <w:rFonts w:ascii="Courier New" w:hAnsi="Courier New" w:cs="Courier New"/>
+          <w:lang w:val="en-US"/>
+        </w:rPr>
+      </w:pPr>
+      <w:r>
+        <w:rPr>
+          <w:rFonts w:ascii="Courier New" w:hAnsi="Courier New" w:cs="Courier New"/>
+          <w:lang w:val="en-US"/>
+        </w:rPr>
+        <w:t>        changed = true;</w:t>
+      </w:r>
+    </w:p>
+    <w:p>
+      <w:pPr>
+        <w:spacing w:after="0"/>
+        <w:rPr>
+          <w:rFonts w:ascii="Courier New" w:hAnsi="Courier New" w:cs="Courier New"/>
+          <w:lang w:val="en-US"/>
+        </w:rPr>
+      </w:pPr>
+      <w:r>
+        <w:rPr>
+          <w:rFonts w:ascii="Courier New" w:hAnsi="Courier New" w:cs="Courier New"/>
+          <w:lang w:val="en-US"/>
+        </w:rPr>
+        <w:t>    }</w:t>
+      </w:r>
+    </w:p>
+    <w:p>
+      <w:pPr>
+        <w:spacing w:after="0"/>
+        <w:rPr>
+          <w:rFonts w:ascii="Courier New" w:hAnsi="Courier New" w:cs="Courier New"/>
+          <w:lang w:val="en-US"/>
+        </w:rPr>
+      </w:pPr>
+    </w:p>
+    <w:p>
+      <w:pPr>
+        <w:spacing w:after="0"/>
+        <w:rPr>
+          <w:rFonts w:ascii="Courier New" w:hAnsi="Courier New" w:cs="Courier New"/>
+          <w:lang w:val="en-US"/>
+        </w:rPr>
+      </w:pPr>
+      <w:r>
+        <w:rPr>
+          <w:rFonts w:ascii="Courier New" w:hAnsi="Courier New" w:cs="Courier New"/>
+          <w:lang w:val="en-US"/>
+        </w:rPr>
+        <w:t>    rawVal = UnpackSignal(rawMsg.data, 5, 5);</w:t>
+      </w:r>
+    </w:p>
+    <w:p>
+      <w:pPr>
+        <w:spacing w:after="0"/>
+        <w:rPr>
+          <w:rFonts w:ascii="Courier New" w:hAnsi="Courier New" w:cs="Courier New"/>
+          <w:lang w:val="en-US"/>
+        </w:rPr>
+      </w:pPr>
+      <w:r>
+        <w:rPr>
+          <w:rFonts w:ascii="Courier New" w:hAnsi="Courier New" w:cs="Courier New"/>
+          <w:lang w:val="en-US"/>
+        </w:rPr>
+        <w:t>    if(_phlp-&gt;Pres_Susp_Rear != rawVal) {</w:t>
+      </w:r>
+    </w:p>
+    <w:p>
+      <w:pPr>
+        <w:spacing w:after="0"/>
+        <w:rPr>
+          <w:rFonts w:ascii="Courier New" w:hAnsi="Courier New" w:cs="Courier New"/>
+          <w:lang w:val="en-US"/>
+        </w:rPr>
+      </w:pPr>
+      <w:r>
+        <w:rPr>
+          <w:rFonts w:ascii="Courier New" w:hAnsi="Courier New" w:cs="Courier New"/>
+          <w:lang w:val="en-US"/>
+        </w:rPr>
+        <w:t>        _phlp-&gt;Pres_Susp_Rear = rawVal;</w:t>
+      </w:r>
+    </w:p>
+    <w:p>
+      <w:pPr>
+        <w:spacing w:after="0"/>
+        <w:rPr>
+          <w:rFonts w:ascii="Courier New" w:hAnsi="Courier New" w:cs="Courier New"/>
+          <w:lang w:val="en-US"/>
+        </w:rPr>
+      </w:pPr>
+      <w:r>
+        <w:rPr>
+          <w:rFonts w:ascii="Courier New" w:hAnsi="Courier New" w:cs="Courier New"/>
+          <w:lang w:val="en-US"/>
+        </w:rPr>
+        <w:t>        changed = true;</w:t>
+      </w:r>
+    </w:p>
+    <w:p>
+      <w:pPr>
+        <w:spacing w:after="0"/>
+        <w:rPr>
+          <w:rFonts w:ascii="Courier New" w:hAnsi="Courier New" w:cs="Courier New"/>
+          <w:lang w:val="en-US"/>
+        </w:rPr>
+      </w:pPr>
+      <w:r>
+        <w:rPr>
+          <w:rFonts w:ascii="Courier New" w:hAnsi="Courier New" w:cs="Courier New"/>
+          <w:lang w:val="en-US"/>
+        </w:rPr>
+        <w:t>    }</w:t>
+      </w:r>
+    </w:p>
+    <w:p>
+      <w:pPr>
+        <w:spacing w:after="0"/>
+        <w:rPr>
+          <w:rFonts w:ascii="Courier New" w:hAnsi="Courier New" w:cs="Courier New"/>
+          <w:lang w:val="en-US"/>
+        </w:rPr>
+      </w:pPr>
+    </w:p>
+    <w:p>
+      <w:pPr>
+        <w:spacing w:after="0"/>
+        <w:rPr>
+          <w:rFonts w:ascii="Courier New" w:hAnsi="Courier New" w:cs="Courier New"/>
+          <w:lang w:val="en-US"/>
+        </w:rPr>
+      </w:pPr>
+      <w:r>
+        <w:rPr>
+          <w:rFonts w:ascii="Courier New" w:hAnsi="Courier New" w:cs="Courier New"/>
+          <w:lang w:val="en-US"/>
+        </w:rPr>
+        <w:t>    rawVal = UnpackSignal(rawMsg.data, 10, 5);</w:t>
+      </w:r>
+    </w:p>
+    <w:p>
+      <w:pPr>
+        <w:spacing w:after="0"/>
+        <w:rPr>
+          <w:rFonts w:ascii="Courier New" w:hAnsi="Courier New" w:cs="Courier New"/>
+          <w:lang w:val="en-US"/>
+        </w:rPr>
+      </w:pPr>
+      <w:r>
+        <w:rPr>
+          <w:rFonts w:ascii="Courier New" w:hAnsi="Courier New" w:cs="Courier New"/>
+          <w:lang w:val="en-US"/>
+        </w:rPr>
+        <w:t>    if(_phlp-&gt;Pres_Brk_Front != rawVal) {</w:t>
+      </w:r>
+    </w:p>
+    <w:p>
+      <w:pPr>
+        <w:spacing w:after="0"/>
+        <w:rPr>
+          <w:rFonts w:ascii="Courier New" w:hAnsi="Courier New" w:cs="Courier New"/>
+          <w:lang w:val="en-US"/>
+        </w:rPr>
+      </w:pPr>
+      <w:r>
+        <w:rPr>
+          <w:rFonts w:ascii="Courier New" w:hAnsi="Courier New" w:cs="Courier New"/>
+          <w:lang w:val="en-US"/>
+        </w:rPr>
+        <w:t>        _phlp-&gt;Pres_Brk_Front = rawVal;</w:t>
+      </w:r>
+    </w:p>
+    <w:p>
+      <w:pPr>
+        <w:spacing w:after="0"/>
+        <w:rPr>
+          <w:rFonts w:ascii="Courier New" w:hAnsi="Courier New" w:cs="Courier New"/>
+          <w:lang w:val="en-US"/>
+        </w:rPr>
+      </w:pPr>
+      <w:r>
+        <w:rPr>
+          <w:rFonts w:ascii="Courier New" w:hAnsi="Courier New" w:cs="Courier New"/>
+          <w:lang w:val="en-US"/>
+        </w:rPr>
+        <w:t>        changed = true;</w:t>
+      </w:r>
+    </w:p>
+    <w:p>
+      <w:pPr>
+        <w:spacing w:after="0"/>
+        <w:rPr>
+          <w:rFonts w:ascii="Courier New" w:hAnsi="Courier New" w:cs="Courier New"/>
+          <w:lang w:val="en-US"/>
+        </w:rPr>
+      </w:pPr>
+      <w:r>
+        <w:rPr>
+          <w:rFonts w:ascii="Courier New" w:hAnsi="Courier New" w:cs="Courier New"/>
+          <w:lang w:val="en-US"/>
+        </w:rPr>
+        <w:t>    }</w:t>
+      </w:r>
+    </w:p>
+    <w:p>
+      <w:pPr>
+        <w:spacing w:after="0"/>
+        <w:rPr>
+          <w:rFonts w:ascii="Courier New" w:hAnsi="Courier New" w:cs="Courier New"/>
+          <w:lang w:val="en-US"/>
+        </w:rPr>
+      </w:pPr>
+    </w:p>
+    <w:p>
+      <w:pPr>
+        <w:spacing w:after="0"/>
+        <w:rPr>
+          <w:rFonts w:ascii="Courier New" w:hAnsi="Courier New" w:cs="Courier New"/>
+          <w:lang w:val="en-US"/>
+        </w:rPr>
+      </w:pPr>
+      <w:r>
+        <w:rPr>
+          <w:rFonts w:ascii="Courier New" w:hAnsi="Courier New" w:cs="Courier New"/>
+          <w:lang w:val="en-US"/>
+        </w:rPr>
+        <w:t>    rawVal = UnpackSignal(rawMsg.data, 15, 5);</w:t>
+      </w:r>
+    </w:p>
+    <w:p>
+      <w:pPr>
+        <w:spacing w:after="0"/>
+        <w:rPr>
+          <w:rFonts w:ascii="Courier New" w:hAnsi="Courier New" w:cs="Courier New"/>
+          <w:lang w:val="en-US"/>
+        </w:rPr>
+      </w:pPr>
+      <w:r>
+        <w:rPr>
+          <w:rFonts w:ascii="Courier New" w:hAnsi="Courier New" w:cs="Courier New"/>
+          <w:lang w:val="en-US"/>
+        </w:rPr>
+        <w:t>    if(_phlp-&gt;Pres_Brk_Rear != rawVal) {</w:t>
+      </w:r>
+    </w:p>
+    <w:p>
+      <w:pPr>
+        <w:spacing w:after="0"/>
+        <w:rPr>
+          <w:rFonts w:ascii="Courier New" w:hAnsi="Courier New" w:cs="Courier New"/>
+          <w:lang w:val="en-US"/>
+        </w:rPr>
+      </w:pPr>
+      <w:r>
+        <w:rPr>
+          <w:rFonts w:ascii="Courier New" w:hAnsi="Courier New" w:cs="Courier New"/>
+          <w:lang w:val="en-US"/>
+        </w:rPr>
+        <w:t>        _phlp-&gt;Pres_Brk_Rear = rawVal;</w:t>
+      </w:r>
+    </w:p>
+    <w:p>
+      <w:pPr>
+        <w:spacing w:after="0"/>
+        <w:rPr>
+          <w:rFonts w:ascii="Courier New" w:hAnsi="Courier New" w:cs="Courier New"/>
+          <w:lang w:val="en-US"/>
+        </w:rPr>
+      </w:pPr>
+      <w:r>
+        <w:rPr>
+          <w:rFonts w:ascii="Courier New" w:hAnsi="Courier New" w:cs="Courier New"/>
+          <w:lang w:val="en-US"/>
+        </w:rPr>
+        <w:t>        changed = true;</w:t>
+      </w:r>
+    </w:p>
+    <w:p>
+      <w:pPr>
+        <w:spacing w:after="0"/>
+        <w:rPr>
+          <w:rFonts w:ascii="Courier New" w:hAnsi="Courier New" w:cs="Courier New"/>
+          <w:lang w:val="en-US"/>
+        </w:rPr>
+      </w:pPr>
+      <w:r>
+        <w:rPr>
+          <w:rFonts w:ascii="Courier New" w:hAnsi="Courier New" w:cs="Courier New"/>
+          <w:lang w:val="en-US"/>
+        </w:rPr>
+        <w:t>    }</w:t>
+      </w:r>
+    </w:p>
+    <w:p>
+      <w:pPr>
+        <w:spacing w:after="0"/>
+        <w:rPr>
+          <w:rFonts w:ascii="Courier New" w:hAnsi="Courier New" w:cs="Courier New"/>
+          <w:lang w:val="en-US"/>
+        </w:rPr>
+      </w:pPr>
+    </w:p>
+    <w:p>
+      <w:pPr>
+        <w:spacing w:after="0"/>
+        <w:rPr>
+          <w:rFonts w:ascii="Courier New" w:hAnsi="Courier New" w:cs="Courier New"/>
+          <w:lang w:val="en-US"/>
+        </w:rPr>
+      </w:pPr>
+      <w:r>
+        <w:rPr>
+          <w:rFonts w:ascii="Courier New" w:hAnsi="Courier New" w:cs="Courier New"/>
+          <w:lang w:val="en-US"/>
+        </w:rPr>
+        <w:t>    rawVal = UnpackSignal(rawMsg.data, 20, 1);</w:t>
+      </w:r>
+    </w:p>
+    <w:p>
+      <w:pPr>
+        <w:spacing w:after="0"/>
+        <w:rPr>
+          <w:rFonts w:ascii="Courier New" w:hAnsi="Courier New" w:cs="Courier New"/>
+          <w:lang w:val="en-US"/>
+        </w:rPr>
+      </w:pPr>
+      <w:r>
+        <w:rPr>
+          <w:rFonts w:ascii="Courier New" w:hAnsi="Courier New" w:cs="Courier New"/>
+          <w:lang w:val="en-US"/>
+        </w:rPr>
+        <w:t>    if(_phlp-&gt;LowBeam_St != rawVal) {</w:t>
+      </w:r>
+    </w:p>
+    <w:p>
+      <w:pPr>
+        <w:spacing w:after="0"/>
+        <w:rPr>
+          <w:rFonts w:ascii="Courier New" w:hAnsi="Courier New" w:cs="Courier New"/>
+          <w:lang w:val="en-US"/>
+        </w:rPr>
+      </w:pPr>
+      <w:r>
+        <w:rPr>
+          <w:rFonts w:ascii="Courier New" w:hAnsi="Courier New" w:cs="Courier New"/>
           <w:lang w:val="en-US"/>
         </w:rPr>
         <w:t xml:space="preserve">        </w:t>
@@ -3494,48 +3621,45 @@
       <w:r>
         <w:rPr>
           <w:rFonts w:ascii="Courier New" w:hAnsi="Courier New" w:cs="Courier New"/>
-          <w:sz w:val="22"/>
-          <w:szCs w:val="22"/>
-          <w:lang w:val="en-US"/>
-        </w:rPr>
-        <w:t>}</w:t>
-      </w:r>
-    </w:p>
-    <w:p>
-      <w:pPr>
-        <w:spacing w:after="0"/>
-        <w:rPr>
-          <w:rFonts w:ascii="Courier New" w:hAnsi="Courier New" w:cs="Courier New"/>
-          <w:sz w:val="22"/>
-          <w:szCs w:val="22"/>
-          <w:lang w:val="en-US"/>
-        </w:rPr>
-      </w:pPr>
-      <w:r>
-        <w:rPr>
-          <w:rFonts w:ascii="Courier New" w:hAnsi="Courier New" w:cs="Courier New"/>
-          <w:sz w:val="22"/>
-          <w:szCs w:val="22"/>
-          <w:lang w:val="en-US"/>
-        </w:rPr>
-        <w:t>        processed--;</w:t>
-      </w:r>
-    </w:p>
-    <w:p>
-      <w:pPr>
-        <w:spacing w:after="0"/>
-        <w:rPr>
-          <w:rFonts w:ascii="Courier New" w:hAnsi="Courier New" w:cs="Courier New"/>
-          <w:sz w:val="22"/>
-          <w:szCs w:val="22"/>
-          <w:lang w:val="en-US"/>
-        </w:rPr>
-      </w:pPr>
-      <w:r>
-        <w:rPr>
-          <w:rFonts w:ascii="Courier New" w:hAnsi="Courier New" w:cs="Courier New"/>
-          <w:sz w:val="22"/>
-          <w:szCs w:val="22"/>
+          <w:lang w:val="en-US"/>
+        </w:rPr>
+        <w:t>_phlp-&gt;LowBeam_St = rawVal;</w:t>
+      </w:r>
+    </w:p>
+    <w:p>
+      <w:pPr>
+        <w:spacing w:after="0"/>
+        <w:rPr>
+          <w:rFonts w:ascii="Courier New" w:hAnsi="Courier New" w:cs="Courier New"/>
+          <w:lang w:val="en-US"/>
+        </w:rPr>
+      </w:pPr>
+      <w:r>
+        <w:rPr>
+          <w:rFonts w:ascii="Courier New" w:hAnsi="Courier New" w:cs="Courier New"/>
+          <w:lang w:val="en-US"/>
+        </w:rPr>
+        <w:t xml:space="preserve">        </w:t>
+      </w:r>
+      <w:r>
+        <w:rPr>
+          <w:rFonts w:ascii="Courier New" w:hAnsi="Courier New" w:cs="Courier New"/>
+          <w:lang w:val="en-US"/>
+        </w:rPr>
+        <w:t>changed = true;</w:t>
+      </w:r>
+    </w:p>
+    <w:p>
+      <w:pPr>
+        <w:spacing w:after="0"/>
+        <w:rPr>
+          <w:rFonts w:ascii="Courier New" w:hAnsi="Courier New" w:cs="Courier New"/>
+          <w:lang w:val="en-US"/>
+        </w:rPr>
+      </w:pPr>
+      <w:r>
+        <w:rPr>
+          <w:rFonts w:ascii="Courier New" w:hAnsi="Courier New" w:cs="Courier New"/>
           <w:lang w:val="en-US"/>
         </w:rPr>
         <w:t>    }</w:t>
@@ -3543,235 +3667,59 @@
     </w:p>
     <w:p>
       <w:pPr>
-        <w:rPr>
-          <w:rFonts w:ascii="Courier New" w:hAnsi="Courier New" w:cs="Courier New"/>
-          <w:sz w:val="22"/>
-          <w:szCs w:val="22"/>
-          <w:lang w:val="en-US"/>
-        </w:rPr>
-      </w:pPr>
-      <w:r>
-        <w:rPr>
-          <w:rFonts w:ascii="Courier New" w:hAnsi="Courier New" w:cs="Courier New"/>
-          <w:sz w:val="22"/>
-          <w:szCs w:val="22"/>
-          <w:lang w:val="en-US"/>
-        </w:rPr>
-        <w:t>}</w:t>
-      </w:r>
-    </w:p>
-    <w:p>
-      <w:pPr>
-        <w:rPr>
-          <w:rFonts w:cs="Calibri"/>
-          <w:lang w:val="en-US"/>
-        </w:rPr>
-      </w:pPr>
-      <w:r>
-        <w:rPr>
-          <w:rFonts w:cs="Calibri"/>
-          <w:lang w:val="en-US"/>
-        </w:rPr>
-        <w:t>We implement the Model’s tick function that runs periodically and get the data from the receiver message queue (</w:t>
-      </w:r>
-      <w:proofErr w:type="gramStart"/>
-      <w:r>
-        <w:rPr>
-          <w:rFonts w:cs="Courier New"/>
-          <w:lang w:val="en-US"/>
-        </w:rPr>
-        <w:t>osMessageQueueGet(</w:t>
-      </w:r>
-      <w:proofErr w:type="gramEnd"/>
-      <w:r>
-        <w:rPr>
-          <w:rFonts w:cs="Courier New"/>
-          <w:lang w:val="en-US"/>
-        </w:rPr>
-        <w:t>guiMQHandle, &amp;rawMsg, 0, 0)</w:t>
-      </w:r>
-      <w:r>
-        <w:rPr>
-          <w:rFonts w:cs="Calibri"/>
-          <w:lang w:val="en-US"/>
-        </w:rPr>
-        <w:t>). Based on the message ID, we switch to a specific parser, which in this case, is the parser for processing the CAN ID 0x10000009.</w:t>
-      </w:r>
-      <w:r>
-        <w:rPr>
-          <w:rFonts w:cs="Calibri"/>
-          <w:lang w:val="en-US"/>
-        </w:rPr>
-        <w:t xml:space="preserve"> </w:t>
-      </w:r>
-    </w:p>
-    <w:p>
-      <w:pPr>
-        <w:spacing w:after="0"/>
-        <w:rPr>
-          <w:rFonts w:ascii="Courier New" w:hAnsi="Courier New" w:cs="Courier New"/>
-          <w:lang w:val="en-US"/>
-        </w:rPr>
-      </w:pPr>
-      <w:r>
-        <w:rPr>
-          <w:rFonts w:ascii="Courier New" w:hAnsi="Courier New" w:cs="Courier New"/>
-          <w:lang w:val="en-US"/>
-        </w:rPr>
-        <w:t xml:space="preserve">bool </w:t>
-      </w:r>
-      <w:proofErr w:type="gramStart"/>
-      <w:r>
-        <w:rPr>
-          <w:rFonts w:ascii="Courier New" w:hAnsi="Courier New" w:cs="Courier New"/>
-          <w:lang w:val="en-US"/>
-        </w:rPr>
-        <w:t>Model::parsePressHydLightPt(</w:t>
-      </w:r>
-      <w:proofErr w:type="gramEnd"/>
-      <w:r>
-        <w:rPr>
-          <w:rFonts w:ascii="Courier New" w:hAnsi="Courier New" w:cs="Courier New"/>
-          <w:lang w:val="en-US"/>
-        </w:rPr>
-        <w:t>CAN_Raw_Msg_t rawMsg, Press_Hydraulic_Light_PowerTrain_t *_phlp) {</w:t>
-      </w:r>
-    </w:p>
-    <w:p>
-      <w:pPr>
-        <w:spacing w:after="0"/>
-        <w:rPr>
-          <w:rFonts w:ascii="Courier New" w:hAnsi="Courier New" w:cs="Courier New"/>
-          <w:lang w:val="en-US"/>
-        </w:rPr>
-      </w:pPr>
-      <w:r>
-        <w:rPr>
-          <w:rFonts w:ascii="Courier New" w:hAnsi="Courier New" w:cs="Courier New"/>
-          <w:lang w:val="en-US"/>
-        </w:rPr>
-        <w:t>    uint64_t rawVal;</w:t>
-      </w:r>
-    </w:p>
-    <w:p>
-      <w:pPr>
-        <w:spacing w:after="0"/>
-        <w:rPr>
-          <w:rFonts w:ascii="Courier New" w:hAnsi="Courier New" w:cs="Courier New"/>
-          <w:lang w:val="en-US"/>
-        </w:rPr>
-      </w:pPr>
-      <w:r>
-        <w:rPr>
-          <w:rFonts w:ascii="Courier New" w:hAnsi="Courier New" w:cs="Courier New"/>
-          <w:lang w:val="en-US"/>
-        </w:rPr>
-        <w:t>    bool changed = false;</w:t>
-      </w:r>
-    </w:p>
-    <w:p>
-      <w:pPr>
-        <w:spacing w:after="0"/>
-        <w:rPr>
-          <w:rFonts w:ascii="Courier New" w:hAnsi="Courier New" w:cs="Courier New"/>
-          <w:lang w:val="en-US"/>
-        </w:rPr>
-      </w:pPr>
-      <w:r>
-        <w:rPr>
-          <w:rFonts w:ascii="Courier New" w:hAnsi="Courier New" w:cs="Courier New"/>
-          <w:lang w:val="en-US"/>
-        </w:rPr>
-        <w:t>    float rawFloat;</w:t>
-      </w:r>
-    </w:p>
-    <w:p>
-      <w:pPr>
-        <w:spacing w:after="0"/>
-        <w:rPr>
-          <w:rFonts w:ascii="Courier New" w:hAnsi="Courier New" w:cs="Courier New"/>
-          <w:lang w:val="en-US"/>
-        </w:rPr>
-      </w:pPr>
-    </w:p>
-    <w:p>
-      <w:pPr>
-        <w:spacing w:after="0"/>
-        <w:rPr>
-          <w:rFonts w:ascii="Courier New" w:hAnsi="Courier New" w:cs="Courier New"/>
-          <w:lang w:val="en-US"/>
-        </w:rPr>
-      </w:pPr>
-      <w:r>
-        <w:rPr>
-          <w:rFonts w:ascii="Courier New" w:hAnsi="Courier New" w:cs="Courier New"/>
-          <w:lang w:val="en-US"/>
-        </w:rPr>
-        <w:t xml:space="preserve">    rawVal = </w:t>
-      </w:r>
-      <w:proofErr w:type="gramStart"/>
-      <w:r>
-        <w:rPr>
-          <w:rFonts w:ascii="Courier New" w:hAnsi="Courier New" w:cs="Courier New"/>
-          <w:lang w:val="en-US"/>
-        </w:rPr>
-        <w:t>UnpackSignal(</w:t>
-      </w:r>
-      <w:proofErr w:type="gramEnd"/>
-      <w:r>
-        <w:rPr>
-          <w:rFonts w:ascii="Courier New" w:hAnsi="Courier New" w:cs="Courier New"/>
-          <w:lang w:val="en-US"/>
-        </w:rPr>
-        <w:t>rawMsg.data, 0, 5);</w:t>
-      </w:r>
-    </w:p>
-    <w:p>
-      <w:pPr>
-        <w:spacing w:after="0"/>
-        <w:rPr>
-          <w:rFonts w:ascii="Courier New" w:hAnsi="Courier New" w:cs="Courier New"/>
-          <w:lang w:val="en-US"/>
-        </w:rPr>
-      </w:pPr>
-      <w:r>
-        <w:rPr>
-          <w:rFonts w:ascii="Courier New" w:hAnsi="Courier New" w:cs="Courier New"/>
-          <w:lang w:val="en-US"/>
-        </w:rPr>
-        <w:t>    if(_phlp-&gt;Pres_Susp_</w:t>
-      </w:r>
-      <w:proofErr w:type="gramStart"/>
-      <w:r>
-        <w:rPr>
-          <w:rFonts w:ascii="Courier New" w:hAnsi="Courier New" w:cs="Courier New"/>
-          <w:lang w:val="en-US"/>
-        </w:rPr>
-        <w:t>Front !</w:t>
-      </w:r>
-      <w:proofErr w:type="gramEnd"/>
-      <w:r>
-        <w:rPr>
-          <w:rFonts w:ascii="Courier New" w:hAnsi="Courier New" w:cs="Courier New"/>
-          <w:lang w:val="en-US"/>
-        </w:rPr>
-        <w:t>= rawVal) {</w:t>
-      </w:r>
-    </w:p>
-    <w:p>
-      <w:pPr>
-        <w:spacing w:after="0"/>
-        <w:rPr>
-          <w:rFonts w:ascii="Courier New" w:hAnsi="Courier New" w:cs="Courier New"/>
-          <w:lang w:val="en-US"/>
-        </w:rPr>
-      </w:pPr>
-      <w:r>
-        <w:rPr>
-          <w:rFonts w:ascii="Courier New" w:hAnsi="Courier New" w:cs="Courier New"/>
-          <w:lang w:val="en-US"/>
-        </w:rPr>
-        <w:t>        _phlp-&gt;Pres_Susp_Front = rawVal;</w:t>
+        <w:spacing w:after="0"/>
+        <w:rPr>
+          <w:rFonts w:ascii="Courier New" w:hAnsi="Courier New" w:cs="Courier New"/>
+          <w:lang w:val="en-US"/>
+        </w:rPr>
+      </w:pPr>
+    </w:p>
+    <w:p>
+      <w:pPr>
+        <w:spacing w:after="0"/>
+        <w:rPr>
+          <w:rFonts w:ascii="Courier New" w:hAnsi="Courier New" w:cs="Courier New"/>
+          <w:lang w:val="en-US"/>
+        </w:rPr>
+      </w:pPr>
+      <w:r>
+        <w:rPr>
+          <w:rFonts w:ascii="Courier New" w:hAnsi="Courier New" w:cs="Courier New"/>
+          <w:lang w:val="en-US"/>
+        </w:rPr>
+        <w:t>    rawVal = UnpackSignal(rawMsg.data, 21, 1);</w:t>
+      </w:r>
+    </w:p>
+    <w:p>
+      <w:pPr>
+        <w:spacing w:after="0"/>
+        <w:rPr>
+          <w:rFonts w:ascii="Courier New" w:hAnsi="Courier New" w:cs="Courier New"/>
+          <w:lang w:val="en-US"/>
+        </w:rPr>
+      </w:pPr>
+      <w:r>
+        <w:rPr>
+          <w:rFonts w:ascii="Courier New" w:hAnsi="Courier New" w:cs="Courier New"/>
+          <w:lang w:val="en-US"/>
+        </w:rPr>
+        <w:t>    if(_phlp-&gt;HighBeam_St != rawVal) {</w:t>
+      </w:r>
+    </w:p>
+    <w:p>
+      <w:pPr>
+        <w:spacing w:after="0"/>
+        <w:rPr>
+          <w:rFonts w:ascii="Courier New" w:hAnsi="Courier New" w:cs="Courier New"/>
+          <w:lang w:val="en-US"/>
+        </w:rPr>
+      </w:pPr>
+      <w:r>
+        <w:rPr>
+          <w:rFonts w:ascii="Courier New" w:hAnsi="Courier New" w:cs="Courier New"/>
+          <w:lang w:val="en-US"/>
+        </w:rPr>
+        <w:t>        _phlp-&gt;HighBeam_St = rawVal;</w:t>
       </w:r>
     </w:p>
     <w:p>
@@ -3828,71 +3776,39 @@
           <w:rFonts w:ascii="Courier New" w:hAnsi="Courier New" w:cs="Courier New"/>
           <w:lang w:val="en-US"/>
         </w:rPr>
-        <w:t xml:space="preserve">    rawVal = </w:t>
-      </w:r>
-      <w:proofErr w:type="gramStart"/>
-      <w:r>
-        <w:rPr>
-          <w:rFonts w:ascii="Courier New" w:hAnsi="Courier New" w:cs="Courier New"/>
-          <w:lang w:val="en-US"/>
-        </w:rPr>
-        <w:t>UnpackSignal(</w:t>
-      </w:r>
-      <w:proofErr w:type="gramEnd"/>
-      <w:r>
-        <w:rPr>
-          <w:rFonts w:ascii="Courier New" w:hAnsi="Courier New" w:cs="Courier New"/>
-          <w:lang w:val="en-US"/>
-        </w:rPr>
-        <w:t>rawMsg.data, 5, 5);</w:t>
-      </w:r>
-    </w:p>
-    <w:p>
-      <w:pPr>
-        <w:spacing w:after="0"/>
-        <w:rPr>
-          <w:rFonts w:ascii="Courier New" w:hAnsi="Courier New" w:cs="Courier New"/>
-          <w:lang w:val="en-US"/>
-        </w:rPr>
-      </w:pPr>
-      <w:r>
-        <w:rPr>
-          <w:rFonts w:ascii="Courier New" w:hAnsi="Courier New" w:cs="Courier New"/>
-          <w:lang w:val="en-US"/>
-        </w:rPr>
-        <w:t>    if(_phlp-&gt;Pres_Susp_</w:t>
-      </w:r>
-      <w:proofErr w:type="gramStart"/>
-      <w:r>
-        <w:rPr>
-          <w:rFonts w:ascii="Courier New" w:hAnsi="Courier New" w:cs="Courier New"/>
-          <w:lang w:val="en-US"/>
-        </w:rPr>
-        <w:t>Rear !</w:t>
-      </w:r>
-      <w:proofErr w:type="gramEnd"/>
-      <w:r>
-        <w:rPr>
-          <w:rFonts w:ascii="Courier New" w:hAnsi="Courier New" w:cs="Courier New"/>
-          <w:lang w:val="en-US"/>
-        </w:rPr>
-        <w:t>= rawVal) {</w:t>
-      </w:r>
-    </w:p>
-    <w:p>
-      <w:pPr>
-        <w:spacing w:after="0"/>
-        <w:rPr>
-          <w:rFonts w:ascii="Courier New" w:hAnsi="Courier New" w:cs="Courier New"/>
-          <w:lang w:val="en-US"/>
-        </w:rPr>
-      </w:pPr>
-      <w:r>
-        <w:rPr>
-          <w:rFonts w:ascii="Courier New" w:hAnsi="Courier New" w:cs="Courier New"/>
-          <w:lang w:val="en-US"/>
-        </w:rPr>
-        <w:t>        _phlp-&gt;Pres_Susp_Rear = rawVal;</w:t>
+        <w:t>    rawVal = UnpackSignal(rawMsg.data, 22, 1);</w:t>
+      </w:r>
+    </w:p>
+    <w:p>
+      <w:pPr>
+        <w:spacing w:after="0"/>
+        <w:rPr>
+          <w:rFonts w:ascii="Courier New" w:hAnsi="Courier New" w:cs="Courier New"/>
+          <w:lang w:val="en-US"/>
+        </w:rPr>
+      </w:pPr>
+      <w:r>
+        <w:rPr>
+          <w:rFonts w:ascii="Courier New" w:hAnsi="Courier New" w:cs="Courier New"/>
+          <w:lang w:val="en-US"/>
+        </w:rPr>
+        <w:t>    if(_phlp-&gt;PosLight_St != rawVal) {</w:t>
+      </w:r>
+    </w:p>
+    <w:p>
+      <w:pPr>
+        <w:spacing w:after="0"/>
+        <w:rPr>
+          <w:rFonts w:ascii="Courier New" w:hAnsi="Courier New" w:cs="Courier New"/>
+          <w:lang w:val="en-US"/>
+        </w:rPr>
+      </w:pPr>
+      <w:r>
+        <w:rPr>
+          <w:rFonts w:ascii="Courier New" w:hAnsi="Courier New" w:cs="Courier New"/>
+          <w:lang w:val="en-US"/>
+        </w:rPr>
+        <w:t>        _phlp-&gt;PosLight_St = rawVal;</w:t>
       </w:r>
     </w:p>
     <w:p>
@@ -3949,71 +3865,39 @@
           <w:rFonts w:ascii="Courier New" w:hAnsi="Courier New" w:cs="Courier New"/>
           <w:lang w:val="en-US"/>
         </w:rPr>
-        <w:t xml:space="preserve">    rawVal = </w:t>
-      </w:r>
-      <w:proofErr w:type="gramStart"/>
-      <w:r>
-        <w:rPr>
-          <w:rFonts w:ascii="Courier New" w:hAnsi="Courier New" w:cs="Courier New"/>
-          <w:lang w:val="en-US"/>
-        </w:rPr>
-        <w:t>UnpackSignal(</w:t>
-      </w:r>
-      <w:proofErr w:type="gramEnd"/>
-      <w:r>
-        <w:rPr>
-          <w:rFonts w:ascii="Courier New" w:hAnsi="Courier New" w:cs="Courier New"/>
-          <w:lang w:val="en-US"/>
-        </w:rPr>
-        <w:t>rawMsg.data, 10, 5);</w:t>
-      </w:r>
-    </w:p>
-    <w:p>
-      <w:pPr>
-        <w:spacing w:after="0"/>
-        <w:rPr>
-          <w:rFonts w:ascii="Courier New" w:hAnsi="Courier New" w:cs="Courier New"/>
-          <w:lang w:val="en-US"/>
-        </w:rPr>
-      </w:pPr>
-      <w:r>
-        <w:rPr>
-          <w:rFonts w:ascii="Courier New" w:hAnsi="Courier New" w:cs="Courier New"/>
-          <w:lang w:val="en-US"/>
-        </w:rPr>
-        <w:t>    if(_phlp-&gt;Pres_Brk_</w:t>
-      </w:r>
-      <w:proofErr w:type="gramStart"/>
-      <w:r>
-        <w:rPr>
-          <w:rFonts w:ascii="Courier New" w:hAnsi="Courier New" w:cs="Courier New"/>
-          <w:lang w:val="en-US"/>
-        </w:rPr>
-        <w:t>Front !</w:t>
-      </w:r>
-      <w:proofErr w:type="gramEnd"/>
-      <w:r>
-        <w:rPr>
-          <w:rFonts w:ascii="Courier New" w:hAnsi="Courier New" w:cs="Courier New"/>
-          <w:lang w:val="en-US"/>
-        </w:rPr>
-        <w:t>= rawVal) {</w:t>
-      </w:r>
-    </w:p>
-    <w:p>
-      <w:pPr>
-        <w:spacing w:after="0"/>
-        <w:rPr>
-          <w:rFonts w:ascii="Courier New" w:hAnsi="Courier New" w:cs="Courier New"/>
-          <w:lang w:val="en-US"/>
-        </w:rPr>
-      </w:pPr>
-      <w:r>
-        <w:rPr>
-          <w:rFonts w:ascii="Courier New" w:hAnsi="Courier New" w:cs="Courier New"/>
-          <w:lang w:val="en-US"/>
-        </w:rPr>
-        <w:t>        _phlp-&gt;Pres_Brk_Front = rawVal;</w:t>
+        <w:t>    rawVal = UnpackSignal(rawMsg.data, 23, 1);</w:t>
+      </w:r>
+    </w:p>
+    <w:p>
+      <w:pPr>
+        <w:spacing w:after="0"/>
+        <w:rPr>
+          <w:rFonts w:ascii="Courier New" w:hAnsi="Courier New" w:cs="Courier New"/>
+          <w:lang w:val="en-US"/>
+        </w:rPr>
+      </w:pPr>
+      <w:r>
+        <w:rPr>
+          <w:rFonts w:ascii="Courier New" w:hAnsi="Courier New" w:cs="Courier New"/>
+          <w:lang w:val="en-US"/>
+        </w:rPr>
+        <w:t>    if(_phlp-&gt;IntLight_St != rawVal) {</w:t>
+      </w:r>
+    </w:p>
+    <w:p>
+      <w:pPr>
+        <w:spacing w:after="0"/>
+        <w:rPr>
+          <w:rFonts w:ascii="Courier New" w:hAnsi="Courier New" w:cs="Courier New"/>
+          <w:lang w:val="en-US"/>
+        </w:rPr>
+      </w:pPr>
+      <w:r>
+        <w:rPr>
+          <w:rFonts w:ascii="Courier New" w:hAnsi="Courier New" w:cs="Courier New"/>
+          <w:lang w:val="en-US"/>
+        </w:rPr>
+        <w:t>        _phlp-&gt;IntLight_St = rawVal;</w:t>
       </w:r>
     </w:p>
     <w:p>
@@ -4070,71 +3954,55 @@
           <w:rFonts w:ascii="Courier New" w:hAnsi="Courier New" w:cs="Courier New"/>
           <w:lang w:val="en-US"/>
         </w:rPr>
-        <w:t xml:space="preserve">    rawVal = </w:t>
-      </w:r>
-      <w:proofErr w:type="gramStart"/>
-      <w:r>
-        <w:rPr>
-          <w:rFonts w:ascii="Courier New" w:hAnsi="Courier New" w:cs="Courier New"/>
-          <w:lang w:val="en-US"/>
-        </w:rPr>
-        <w:t>UnpackSignal(</w:t>
-      </w:r>
-      <w:proofErr w:type="gramEnd"/>
-      <w:r>
-        <w:rPr>
-          <w:rFonts w:ascii="Courier New" w:hAnsi="Courier New" w:cs="Courier New"/>
-          <w:lang w:val="en-US"/>
-        </w:rPr>
-        <w:t>rawMsg.data, 15, 5);</w:t>
-      </w:r>
-    </w:p>
-    <w:p>
-      <w:pPr>
-        <w:spacing w:after="0"/>
-        <w:rPr>
-          <w:rFonts w:ascii="Courier New" w:hAnsi="Courier New" w:cs="Courier New"/>
-          <w:lang w:val="en-US"/>
-        </w:rPr>
-      </w:pPr>
-      <w:r>
-        <w:rPr>
-          <w:rFonts w:ascii="Courier New" w:hAnsi="Courier New" w:cs="Courier New"/>
-          <w:lang w:val="en-US"/>
-        </w:rPr>
-        <w:t>    if(_phlp-&gt;Pres_Brk_</w:t>
-      </w:r>
-      <w:proofErr w:type="gramStart"/>
-      <w:r>
-        <w:rPr>
-          <w:rFonts w:ascii="Courier New" w:hAnsi="Courier New" w:cs="Courier New"/>
-          <w:lang w:val="en-US"/>
-        </w:rPr>
-        <w:t>Rear !</w:t>
-      </w:r>
-      <w:proofErr w:type="gramEnd"/>
-      <w:r>
-        <w:rPr>
-          <w:rFonts w:ascii="Courier New" w:hAnsi="Courier New" w:cs="Courier New"/>
-          <w:lang w:val="en-US"/>
-        </w:rPr>
-        <w:t>= rawVal) {</w:t>
-      </w:r>
-    </w:p>
-    <w:p>
-      <w:pPr>
-        <w:spacing w:after="0"/>
-        <w:rPr>
-          <w:rFonts w:ascii="Courier New" w:hAnsi="Courier New" w:cs="Courier New"/>
-          <w:lang w:val="en-US"/>
-        </w:rPr>
-      </w:pPr>
-      <w:r>
-        <w:rPr>
-          <w:rFonts w:ascii="Courier New" w:hAnsi="Courier New" w:cs="Courier New"/>
-          <w:lang w:val="en-US"/>
-        </w:rPr>
-        <w:t>        _phlp-&gt;Pres_Brk_Rear = rawVal;</w:t>
+        <w:t>    rawVal = UnpackSignal(rawMsg.data, 24, 12);</w:t>
+      </w:r>
+    </w:p>
+    <w:p>
+      <w:pPr>
+        <w:spacing w:after="0"/>
+        <w:rPr>
+          <w:rFonts w:ascii="Courier New" w:hAnsi="Courier New" w:cs="Courier New"/>
+          <w:lang w:val="en-US"/>
+        </w:rPr>
+      </w:pPr>
+      <w:r>
+        <w:rPr>
+          <w:rFonts w:ascii="Courier New" w:hAnsi="Courier New" w:cs="Courier New"/>
+          <w:lang w:val="en-US"/>
+        </w:rPr>
+        <w:t>    rawVal = rawVal -2500;</w:t>
+      </w:r>
+    </w:p>
+    <w:p>
+      <w:pPr>
+        <w:spacing w:after="0"/>
+        <w:rPr>
+          <w:rFonts w:ascii="Courier New" w:hAnsi="Courier New" w:cs="Courier New"/>
+          <w:lang w:val="en-US"/>
+        </w:rPr>
+      </w:pPr>
+      <w:r>
+        <w:rPr>
+          <w:rFonts w:ascii="Courier New" w:hAnsi="Courier New" w:cs="Courier New"/>
+          <w:lang w:val="en-US"/>
+        </w:rPr>
+        <w:t>    if(_phlp-&gt;Pwr_Act_MotRM != rawVal) {</w:t>
+      </w:r>
+    </w:p>
+    <w:p>
+      <w:pPr>
+        <w:spacing w:after="0"/>
+        <w:rPr>
+          <w:rFonts w:ascii="Courier New" w:hAnsi="Courier New" w:cs="Courier New"/>
+          <w:lang w:val="en-US"/>
+        </w:rPr>
+      </w:pPr>
+      <w:r>
+        <w:rPr>
+          <w:rFonts w:ascii="Courier New" w:hAnsi="Courier New" w:cs="Courier New"/>
+          <w:lang w:val="en-US"/>
+        </w:rPr>
+        <w:t>        _phlp-&gt;Pwr_Act_MotRM = rawVal;</w:t>
       </w:r>
     </w:p>
     <w:p>
@@ -4191,658 +4059,7 @@
           <w:rFonts w:ascii="Courier New" w:hAnsi="Courier New" w:cs="Courier New"/>
           <w:lang w:val="en-US"/>
         </w:rPr>
-        <w:t xml:space="preserve">    rawVal = </w:t>
-      </w:r>
-      <w:proofErr w:type="gramStart"/>
-      <w:r>
-        <w:rPr>
-          <w:rFonts w:ascii="Courier New" w:hAnsi="Courier New" w:cs="Courier New"/>
-          <w:lang w:val="en-US"/>
-        </w:rPr>
-        <w:t>UnpackSignal(</w:t>
-      </w:r>
-      <w:proofErr w:type="gramEnd"/>
-      <w:r>
-        <w:rPr>
-          <w:rFonts w:ascii="Courier New" w:hAnsi="Courier New" w:cs="Courier New"/>
-          <w:lang w:val="en-US"/>
-        </w:rPr>
-        <w:t>rawMsg.data, 20, 1);</w:t>
-      </w:r>
-    </w:p>
-    <w:p>
-      <w:pPr>
-        <w:spacing w:after="0"/>
-        <w:rPr>
-          <w:rFonts w:ascii="Courier New" w:hAnsi="Courier New" w:cs="Courier New"/>
-          <w:lang w:val="en-US"/>
-        </w:rPr>
-      </w:pPr>
-      <w:r>
-        <w:rPr>
-          <w:rFonts w:ascii="Courier New" w:hAnsi="Courier New" w:cs="Courier New"/>
-          <w:lang w:val="en-US"/>
-        </w:rPr>
-        <w:t>    if(_phlp-&gt;LowBeam_</w:t>
-      </w:r>
-      <w:proofErr w:type="gramStart"/>
-      <w:r>
-        <w:rPr>
-          <w:rFonts w:ascii="Courier New" w:hAnsi="Courier New" w:cs="Courier New"/>
-          <w:lang w:val="en-US"/>
-        </w:rPr>
-        <w:t>St !</w:t>
-      </w:r>
-      <w:proofErr w:type="gramEnd"/>
-      <w:r>
-        <w:rPr>
-          <w:rFonts w:ascii="Courier New" w:hAnsi="Courier New" w:cs="Courier New"/>
-          <w:lang w:val="en-US"/>
-        </w:rPr>
-        <w:t>= rawVal) {</w:t>
-      </w:r>
-    </w:p>
-    <w:p>
-      <w:pPr>
-        <w:spacing w:after="0"/>
-        <w:rPr>
-          <w:rFonts w:ascii="Courier New" w:hAnsi="Courier New" w:cs="Courier New"/>
-          <w:lang w:val="en-US"/>
-        </w:rPr>
-      </w:pPr>
-      <w:r>
-        <w:rPr>
-          <w:rFonts w:ascii="Courier New" w:hAnsi="Courier New" w:cs="Courier New"/>
-          <w:lang w:val="en-US"/>
-        </w:rPr>
-        <w:t xml:space="preserve">        </w:t>
-      </w:r>
-      <w:r>
-        <w:rPr>
-          <w:rFonts w:ascii="Courier New" w:hAnsi="Courier New" w:cs="Courier New"/>
-          <w:lang w:val="en-US"/>
-        </w:rPr>
-        <w:t>_phlp-&gt;LowBeam_St = rawVal;</w:t>
-      </w:r>
-    </w:p>
-    <w:p>
-      <w:pPr>
-        <w:spacing w:after="0"/>
-        <w:rPr>
-          <w:rFonts w:ascii="Courier New" w:hAnsi="Courier New" w:cs="Courier New"/>
-          <w:lang w:val="en-US"/>
-        </w:rPr>
-      </w:pPr>
-      <w:r>
-        <w:rPr>
-          <w:rFonts w:ascii="Courier New" w:hAnsi="Courier New" w:cs="Courier New"/>
-          <w:lang w:val="en-US"/>
-        </w:rPr>
-        <w:t xml:space="preserve">        </w:t>
-      </w:r>
-      <w:r>
-        <w:rPr>
-          <w:rFonts w:ascii="Courier New" w:hAnsi="Courier New" w:cs="Courier New"/>
-          <w:lang w:val="en-US"/>
-        </w:rPr>
-        <w:t>changed = true;</w:t>
-      </w:r>
-    </w:p>
-    <w:p>
-      <w:pPr>
-        <w:spacing w:after="0"/>
-        <w:rPr>
-          <w:rFonts w:ascii="Courier New" w:hAnsi="Courier New" w:cs="Courier New"/>
-          <w:lang w:val="en-US"/>
-        </w:rPr>
-      </w:pPr>
-      <w:r>
-        <w:rPr>
-          <w:rFonts w:ascii="Courier New" w:hAnsi="Courier New" w:cs="Courier New"/>
-          <w:lang w:val="en-US"/>
-        </w:rPr>
-        <w:t>    }</w:t>
-      </w:r>
-    </w:p>
-    <w:p>
-      <w:pPr>
-        <w:spacing w:after="0"/>
-        <w:rPr>
-          <w:rFonts w:ascii="Courier New" w:hAnsi="Courier New" w:cs="Courier New"/>
-          <w:lang w:val="en-US"/>
-        </w:rPr>
-      </w:pPr>
-    </w:p>
-    <w:p>
-      <w:pPr>
-        <w:spacing w:after="0"/>
-        <w:rPr>
-          <w:rFonts w:ascii="Courier New" w:hAnsi="Courier New" w:cs="Courier New"/>
-          <w:lang w:val="en-US"/>
-        </w:rPr>
-      </w:pPr>
-      <w:r>
-        <w:rPr>
-          <w:rFonts w:ascii="Courier New" w:hAnsi="Courier New" w:cs="Courier New"/>
-          <w:lang w:val="en-US"/>
-        </w:rPr>
-        <w:t xml:space="preserve">    rawVal = </w:t>
-      </w:r>
-      <w:proofErr w:type="gramStart"/>
-      <w:r>
-        <w:rPr>
-          <w:rFonts w:ascii="Courier New" w:hAnsi="Courier New" w:cs="Courier New"/>
-          <w:lang w:val="en-US"/>
-        </w:rPr>
-        <w:t>UnpackSignal(</w:t>
-      </w:r>
-      <w:proofErr w:type="gramEnd"/>
-      <w:r>
-        <w:rPr>
-          <w:rFonts w:ascii="Courier New" w:hAnsi="Courier New" w:cs="Courier New"/>
-          <w:lang w:val="en-US"/>
-        </w:rPr>
-        <w:t>rawMsg.data, 21, 1);</w:t>
-      </w:r>
-    </w:p>
-    <w:p>
-      <w:pPr>
-        <w:spacing w:after="0"/>
-        <w:rPr>
-          <w:rFonts w:ascii="Courier New" w:hAnsi="Courier New" w:cs="Courier New"/>
-          <w:lang w:val="en-US"/>
-        </w:rPr>
-      </w:pPr>
-      <w:r>
-        <w:rPr>
-          <w:rFonts w:ascii="Courier New" w:hAnsi="Courier New" w:cs="Courier New"/>
-          <w:lang w:val="en-US"/>
-        </w:rPr>
-        <w:t>    if(_phlp-&gt;HighBeam_</w:t>
-      </w:r>
-      <w:proofErr w:type="gramStart"/>
-      <w:r>
-        <w:rPr>
-          <w:rFonts w:ascii="Courier New" w:hAnsi="Courier New" w:cs="Courier New"/>
-          <w:lang w:val="en-US"/>
-        </w:rPr>
-        <w:t>St !</w:t>
-      </w:r>
-      <w:proofErr w:type="gramEnd"/>
-      <w:r>
-        <w:rPr>
-          <w:rFonts w:ascii="Courier New" w:hAnsi="Courier New" w:cs="Courier New"/>
-          <w:lang w:val="en-US"/>
-        </w:rPr>
-        <w:t>= rawVal) {</w:t>
-      </w:r>
-    </w:p>
-    <w:p>
-      <w:pPr>
-        <w:spacing w:after="0"/>
-        <w:rPr>
-          <w:rFonts w:ascii="Courier New" w:hAnsi="Courier New" w:cs="Courier New"/>
-          <w:lang w:val="en-US"/>
-        </w:rPr>
-      </w:pPr>
-      <w:r>
-        <w:rPr>
-          <w:rFonts w:ascii="Courier New" w:hAnsi="Courier New" w:cs="Courier New"/>
-          <w:lang w:val="en-US"/>
-        </w:rPr>
-        <w:t>        _phlp-&gt;HighBeam_St = rawVal;</w:t>
-      </w:r>
-    </w:p>
-    <w:p>
-      <w:pPr>
-        <w:spacing w:after="0"/>
-        <w:rPr>
-          <w:rFonts w:ascii="Courier New" w:hAnsi="Courier New" w:cs="Courier New"/>
-          <w:lang w:val="en-US"/>
-        </w:rPr>
-      </w:pPr>
-      <w:r>
-        <w:rPr>
-          <w:rFonts w:ascii="Courier New" w:hAnsi="Courier New" w:cs="Courier New"/>
-          <w:lang w:val="en-US"/>
-        </w:rPr>
-        <w:t>        changed = true;</w:t>
-      </w:r>
-    </w:p>
-    <w:p>
-      <w:pPr>
-        <w:spacing w:after="0"/>
-        <w:rPr>
-          <w:rFonts w:ascii="Courier New" w:hAnsi="Courier New" w:cs="Courier New"/>
-          <w:lang w:val="en-US"/>
-        </w:rPr>
-      </w:pPr>
-      <w:r>
-        <w:rPr>
-          <w:rFonts w:ascii="Courier New" w:hAnsi="Courier New" w:cs="Courier New"/>
-          <w:lang w:val="en-US"/>
-        </w:rPr>
-        <w:t>    }</w:t>
-      </w:r>
-    </w:p>
-    <w:p>
-      <w:pPr>
-        <w:spacing w:after="0"/>
-        <w:rPr>
-          <w:rFonts w:ascii="Courier New" w:hAnsi="Courier New" w:cs="Courier New"/>
-          <w:lang w:val="en-US"/>
-        </w:rPr>
-      </w:pPr>
-    </w:p>
-    <w:p>
-      <w:pPr>
-        <w:spacing w:after="0"/>
-        <w:rPr>
-          <w:rFonts w:ascii="Courier New" w:hAnsi="Courier New" w:cs="Courier New"/>
-          <w:lang w:val="en-US"/>
-        </w:rPr>
-      </w:pPr>
-      <w:r>
-        <w:rPr>
-          <w:rFonts w:ascii="Courier New" w:hAnsi="Courier New" w:cs="Courier New"/>
-          <w:lang w:val="en-US"/>
-        </w:rPr>
-        <w:t xml:space="preserve">    rawVal = </w:t>
-      </w:r>
-      <w:proofErr w:type="gramStart"/>
-      <w:r>
-        <w:rPr>
-          <w:rFonts w:ascii="Courier New" w:hAnsi="Courier New" w:cs="Courier New"/>
-          <w:lang w:val="en-US"/>
-        </w:rPr>
-        <w:t>UnpackSignal(</w:t>
-      </w:r>
-      <w:proofErr w:type="gramEnd"/>
-      <w:r>
-        <w:rPr>
-          <w:rFonts w:ascii="Courier New" w:hAnsi="Courier New" w:cs="Courier New"/>
-          <w:lang w:val="en-US"/>
-        </w:rPr>
-        <w:t>rawMsg.data, 22, 1);</w:t>
-      </w:r>
-    </w:p>
-    <w:p>
-      <w:pPr>
-        <w:spacing w:after="0"/>
-        <w:rPr>
-          <w:rFonts w:ascii="Courier New" w:hAnsi="Courier New" w:cs="Courier New"/>
-          <w:lang w:val="en-US"/>
-        </w:rPr>
-      </w:pPr>
-      <w:r>
-        <w:rPr>
-          <w:rFonts w:ascii="Courier New" w:hAnsi="Courier New" w:cs="Courier New"/>
-          <w:lang w:val="en-US"/>
-        </w:rPr>
-        <w:t>    if(_phlp-&gt;PosLight_</w:t>
-      </w:r>
-      <w:proofErr w:type="gramStart"/>
-      <w:r>
-        <w:rPr>
-          <w:rFonts w:ascii="Courier New" w:hAnsi="Courier New" w:cs="Courier New"/>
-          <w:lang w:val="en-US"/>
-        </w:rPr>
-        <w:t>St !</w:t>
-      </w:r>
-      <w:proofErr w:type="gramEnd"/>
-      <w:r>
-        <w:rPr>
-          <w:rFonts w:ascii="Courier New" w:hAnsi="Courier New" w:cs="Courier New"/>
-          <w:lang w:val="en-US"/>
-        </w:rPr>
-        <w:t>= rawVal) {</w:t>
-      </w:r>
-    </w:p>
-    <w:p>
-      <w:pPr>
-        <w:spacing w:after="0"/>
-        <w:rPr>
-          <w:rFonts w:ascii="Courier New" w:hAnsi="Courier New" w:cs="Courier New"/>
-          <w:lang w:val="en-US"/>
-        </w:rPr>
-      </w:pPr>
-      <w:r>
-        <w:rPr>
-          <w:rFonts w:ascii="Courier New" w:hAnsi="Courier New" w:cs="Courier New"/>
-          <w:lang w:val="en-US"/>
-        </w:rPr>
-        <w:t>        _phlp-&gt;PosLight_St = rawVal;</w:t>
-      </w:r>
-    </w:p>
-    <w:p>
-      <w:pPr>
-        <w:spacing w:after="0"/>
-        <w:rPr>
-          <w:rFonts w:ascii="Courier New" w:hAnsi="Courier New" w:cs="Courier New"/>
-          <w:lang w:val="en-US"/>
-        </w:rPr>
-      </w:pPr>
-      <w:r>
-        <w:rPr>
-          <w:rFonts w:ascii="Courier New" w:hAnsi="Courier New" w:cs="Courier New"/>
-          <w:lang w:val="en-US"/>
-        </w:rPr>
-        <w:t>        changed = true;</w:t>
-      </w:r>
-    </w:p>
-    <w:p>
-      <w:pPr>
-        <w:spacing w:after="0"/>
-        <w:rPr>
-          <w:rFonts w:ascii="Courier New" w:hAnsi="Courier New" w:cs="Courier New"/>
-          <w:lang w:val="en-US"/>
-        </w:rPr>
-      </w:pPr>
-      <w:r>
-        <w:rPr>
-          <w:rFonts w:ascii="Courier New" w:hAnsi="Courier New" w:cs="Courier New"/>
-          <w:lang w:val="en-US"/>
-        </w:rPr>
-        <w:t>    }</w:t>
-      </w:r>
-    </w:p>
-    <w:p>
-      <w:pPr>
-        <w:spacing w:after="0"/>
-        <w:rPr>
-          <w:rFonts w:ascii="Courier New" w:hAnsi="Courier New" w:cs="Courier New"/>
-          <w:lang w:val="en-US"/>
-        </w:rPr>
-      </w:pPr>
-    </w:p>
-    <w:p>
-      <w:pPr>
-        <w:spacing w:after="0"/>
-        <w:rPr>
-          <w:rFonts w:ascii="Courier New" w:hAnsi="Courier New" w:cs="Courier New"/>
-          <w:lang w:val="en-US"/>
-        </w:rPr>
-      </w:pPr>
-      <w:r>
-        <w:rPr>
-          <w:rFonts w:ascii="Courier New" w:hAnsi="Courier New" w:cs="Courier New"/>
-          <w:lang w:val="en-US"/>
-        </w:rPr>
-        <w:t xml:space="preserve">    rawVal = </w:t>
-      </w:r>
-      <w:proofErr w:type="gramStart"/>
-      <w:r>
-        <w:rPr>
-          <w:rFonts w:ascii="Courier New" w:hAnsi="Courier New" w:cs="Courier New"/>
-          <w:lang w:val="en-US"/>
-        </w:rPr>
-        <w:t>UnpackSignal(</w:t>
-      </w:r>
-      <w:proofErr w:type="gramEnd"/>
-      <w:r>
-        <w:rPr>
-          <w:rFonts w:ascii="Courier New" w:hAnsi="Courier New" w:cs="Courier New"/>
-          <w:lang w:val="en-US"/>
-        </w:rPr>
-        <w:t>rawMsg.data, 23, 1);</w:t>
-      </w:r>
-    </w:p>
-    <w:p>
-      <w:pPr>
-        <w:spacing w:after="0"/>
-        <w:rPr>
-          <w:rFonts w:ascii="Courier New" w:hAnsi="Courier New" w:cs="Courier New"/>
-          <w:lang w:val="en-US"/>
-        </w:rPr>
-      </w:pPr>
-      <w:r>
-        <w:rPr>
-          <w:rFonts w:ascii="Courier New" w:hAnsi="Courier New" w:cs="Courier New"/>
-          <w:lang w:val="en-US"/>
-        </w:rPr>
-        <w:t>    if(_phlp-&gt;IntLight_</w:t>
-      </w:r>
-      <w:proofErr w:type="gramStart"/>
-      <w:r>
-        <w:rPr>
-          <w:rFonts w:ascii="Courier New" w:hAnsi="Courier New" w:cs="Courier New"/>
-          <w:lang w:val="en-US"/>
-        </w:rPr>
-        <w:t>St !</w:t>
-      </w:r>
-      <w:proofErr w:type="gramEnd"/>
-      <w:r>
-        <w:rPr>
-          <w:rFonts w:ascii="Courier New" w:hAnsi="Courier New" w:cs="Courier New"/>
-          <w:lang w:val="en-US"/>
-        </w:rPr>
-        <w:t>= rawVal) {</w:t>
-      </w:r>
-    </w:p>
-    <w:p>
-      <w:pPr>
-        <w:spacing w:after="0"/>
-        <w:rPr>
-          <w:rFonts w:ascii="Courier New" w:hAnsi="Courier New" w:cs="Courier New"/>
-          <w:lang w:val="en-US"/>
-        </w:rPr>
-      </w:pPr>
-      <w:r>
-        <w:rPr>
-          <w:rFonts w:ascii="Courier New" w:hAnsi="Courier New" w:cs="Courier New"/>
-          <w:lang w:val="en-US"/>
-        </w:rPr>
-        <w:t>        _phlp-&gt;IntLight_St = rawVal;</w:t>
-      </w:r>
-    </w:p>
-    <w:p>
-      <w:pPr>
-        <w:spacing w:after="0"/>
-        <w:rPr>
-          <w:rFonts w:ascii="Courier New" w:hAnsi="Courier New" w:cs="Courier New"/>
-          <w:lang w:val="en-US"/>
-        </w:rPr>
-      </w:pPr>
-      <w:r>
-        <w:rPr>
-          <w:rFonts w:ascii="Courier New" w:hAnsi="Courier New" w:cs="Courier New"/>
-          <w:lang w:val="en-US"/>
-        </w:rPr>
-        <w:t>        changed = true;</w:t>
-      </w:r>
-    </w:p>
-    <w:p>
-      <w:pPr>
-        <w:spacing w:after="0"/>
-        <w:rPr>
-          <w:rFonts w:ascii="Courier New" w:hAnsi="Courier New" w:cs="Courier New"/>
-          <w:lang w:val="en-US"/>
-        </w:rPr>
-      </w:pPr>
-      <w:r>
-        <w:rPr>
-          <w:rFonts w:ascii="Courier New" w:hAnsi="Courier New" w:cs="Courier New"/>
-          <w:lang w:val="en-US"/>
-        </w:rPr>
-        <w:t>    }</w:t>
-      </w:r>
-    </w:p>
-    <w:p>
-      <w:pPr>
-        <w:spacing w:after="0"/>
-        <w:rPr>
-          <w:rFonts w:ascii="Courier New" w:hAnsi="Courier New" w:cs="Courier New"/>
-          <w:lang w:val="en-US"/>
-        </w:rPr>
-      </w:pPr>
-    </w:p>
-    <w:p>
-      <w:pPr>
-        <w:spacing w:after="0"/>
-        <w:rPr>
-          <w:rFonts w:ascii="Courier New" w:hAnsi="Courier New" w:cs="Courier New"/>
-          <w:lang w:val="en-US"/>
-        </w:rPr>
-      </w:pPr>
-      <w:r>
-        <w:rPr>
-          <w:rFonts w:ascii="Courier New" w:hAnsi="Courier New" w:cs="Courier New"/>
-          <w:lang w:val="en-US"/>
-        </w:rPr>
-        <w:t xml:space="preserve">    rawVal = </w:t>
-      </w:r>
-      <w:proofErr w:type="gramStart"/>
-      <w:r>
-        <w:rPr>
-          <w:rFonts w:ascii="Courier New" w:hAnsi="Courier New" w:cs="Courier New"/>
-          <w:lang w:val="en-US"/>
-        </w:rPr>
-        <w:t>UnpackSignal(</w:t>
-      </w:r>
-      <w:proofErr w:type="gramEnd"/>
-      <w:r>
-        <w:rPr>
-          <w:rFonts w:ascii="Courier New" w:hAnsi="Courier New" w:cs="Courier New"/>
-          <w:lang w:val="en-US"/>
-        </w:rPr>
-        <w:t>rawMsg.data, 24, 12);</w:t>
-      </w:r>
-    </w:p>
-    <w:p>
-      <w:pPr>
-        <w:spacing w:after="0"/>
-        <w:rPr>
-          <w:rFonts w:ascii="Courier New" w:hAnsi="Courier New" w:cs="Courier New"/>
-          <w:lang w:val="en-US"/>
-        </w:rPr>
-      </w:pPr>
-      <w:r>
-        <w:rPr>
-          <w:rFonts w:ascii="Courier New" w:hAnsi="Courier New" w:cs="Courier New"/>
-          <w:lang w:val="en-US"/>
-        </w:rPr>
-        <w:t>    rawVal = rawVal -2500;</w:t>
-      </w:r>
-    </w:p>
-    <w:p>
-      <w:pPr>
-        <w:spacing w:after="0"/>
-        <w:rPr>
-          <w:rFonts w:ascii="Courier New" w:hAnsi="Courier New" w:cs="Courier New"/>
-          <w:lang w:val="en-US"/>
-        </w:rPr>
-      </w:pPr>
-      <w:r>
-        <w:rPr>
-          <w:rFonts w:ascii="Courier New" w:hAnsi="Courier New" w:cs="Courier New"/>
-          <w:lang w:val="en-US"/>
-        </w:rPr>
-        <w:t>    if(_phlp-&gt;Pwr_Act_</w:t>
-      </w:r>
-      <w:proofErr w:type="gramStart"/>
-      <w:r>
-        <w:rPr>
-          <w:rFonts w:ascii="Courier New" w:hAnsi="Courier New" w:cs="Courier New"/>
-          <w:lang w:val="en-US"/>
-        </w:rPr>
-        <w:t>MotRM !</w:t>
-      </w:r>
-      <w:proofErr w:type="gramEnd"/>
-      <w:r>
-        <w:rPr>
-          <w:rFonts w:ascii="Courier New" w:hAnsi="Courier New" w:cs="Courier New"/>
-          <w:lang w:val="en-US"/>
-        </w:rPr>
-        <w:t>= rawVal) {</w:t>
-      </w:r>
-    </w:p>
-    <w:p>
-      <w:pPr>
-        <w:spacing w:after="0"/>
-        <w:rPr>
-          <w:rFonts w:ascii="Courier New" w:hAnsi="Courier New" w:cs="Courier New"/>
-          <w:lang w:val="en-US"/>
-        </w:rPr>
-      </w:pPr>
-      <w:r>
-        <w:rPr>
-          <w:rFonts w:ascii="Courier New" w:hAnsi="Courier New" w:cs="Courier New"/>
-          <w:lang w:val="en-US"/>
-        </w:rPr>
-        <w:t>        _phlp-&gt;Pwr_Act_MotRM = rawVal;</w:t>
-      </w:r>
-    </w:p>
-    <w:p>
-      <w:pPr>
-        <w:spacing w:after="0"/>
-        <w:rPr>
-          <w:rFonts w:ascii="Courier New" w:hAnsi="Courier New" w:cs="Courier New"/>
-          <w:lang w:val="en-US"/>
-        </w:rPr>
-      </w:pPr>
-      <w:r>
-        <w:rPr>
-          <w:rFonts w:ascii="Courier New" w:hAnsi="Courier New" w:cs="Courier New"/>
-          <w:lang w:val="en-US"/>
-        </w:rPr>
-        <w:t>        changed = true;</w:t>
-      </w:r>
-    </w:p>
-    <w:p>
-      <w:pPr>
-        <w:spacing w:after="0"/>
-        <w:rPr>
-          <w:rFonts w:ascii="Courier New" w:hAnsi="Courier New" w:cs="Courier New"/>
-          <w:lang w:val="en-US"/>
-        </w:rPr>
-      </w:pPr>
-      <w:r>
-        <w:rPr>
-          <w:rFonts w:ascii="Courier New" w:hAnsi="Courier New" w:cs="Courier New"/>
-          <w:lang w:val="en-US"/>
-        </w:rPr>
-        <w:t>    }</w:t>
-      </w:r>
-    </w:p>
-    <w:p>
-      <w:pPr>
-        <w:spacing w:after="0"/>
-        <w:rPr>
-          <w:rFonts w:ascii="Courier New" w:hAnsi="Courier New" w:cs="Courier New"/>
-          <w:lang w:val="en-US"/>
-        </w:rPr>
-      </w:pPr>
-    </w:p>
-    <w:p>
-      <w:pPr>
-        <w:spacing w:after="0"/>
-        <w:rPr>
-          <w:rFonts w:ascii="Courier New" w:hAnsi="Courier New" w:cs="Courier New"/>
-          <w:lang w:val="en-US"/>
-        </w:rPr>
-      </w:pPr>
-      <w:r>
-        <w:rPr>
-          <w:rFonts w:ascii="Courier New" w:hAnsi="Courier New" w:cs="Courier New"/>
-          <w:lang w:val="en-US"/>
-        </w:rPr>
-        <w:t xml:space="preserve">    rawVal = </w:t>
-      </w:r>
-      <w:proofErr w:type="gramStart"/>
-      <w:r>
-        <w:rPr>
-          <w:rFonts w:ascii="Courier New" w:hAnsi="Courier New" w:cs="Courier New"/>
-          <w:lang w:val="en-US"/>
-        </w:rPr>
-        <w:t>UnpackSignal(</w:t>
-      </w:r>
-      <w:proofErr w:type="gramEnd"/>
-      <w:r>
-        <w:rPr>
-          <w:rFonts w:ascii="Courier New" w:hAnsi="Courier New" w:cs="Courier New"/>
-          <w:lang w:val="en-US"/>
-        </w:rPr>
-        <w:t>rawMsg.data, 36, 12);</w:t>
+        <w:t>    rawVal = UnpackSignal(rawMsg.data, 36, 12);</w:t>
       </w:r>
     </w:p>
     <w:p>
@@ -4875,23 +4092,7 @@
           <w:rFonts w:ascii="Courier New" w:hAnsi="Courier New" w:cs="Courier New"/>
           <w:lang w:val="en-US"/>
         </w:rPr>
-        <w:t>    if(_phlp-&gt;Pwr_Act_</w:t>
-      </w:r>
-      <w:proofErr w:type="gramStart"/>
-      <w:r>
-        <w:rPr>
-          <w:rFonts w:ascii="Courier New" w:hAnsi="Courier New" w:cs="Courier New"/>
-          <w:lang w:val="en-US"/>
-        </w:rPr>
-        <w:t>MotFL !</w:t>
-      </w:r>
-      <w:proofErr w:type="gramEnd"/>
-      <w:r>
-        <w:rPr>
-          <w:rFonts w:ascii="Courier New" w:hAnsi="Courier New" w:cs="Courier New"/>
-          <w:lang w:val="en-US"/>
-        </w:rPr>
-        <w:t>= rawVal) {</w:t>
+        <w:t>    if(_phlp-&gt;Pwr_Act_MotFL != rawVal) {</w:t>
       </w:r>
     </w:p>
     <w:p>
@@ -4964,23 +4165,7 @@
           <w:rFonts w:ascii="Courier New" w:hAnsi="Courier New" w:cs="Courier New"/>
           <w:lang w:val="en-US"/>
         </w:rPr>
-        <w:t xml:space="preserve">    rawVal = </w:t>
-      </w:r>
-      <w:proofErr w:type="gramStart"/>
-      <w:r>
-        <w:rPr>
-          <w:rFonts w:ascii="Courier New" w:hAnsi="Courier New" w:cs="Courier New"/>
-          <w:lang w:val="en-US"/>
-        </w:rPr>
-        <w:t>UnpackSignal(</w:t>
-      </w:r>
-      <w:proofErr w:type="gramEnd"/>
-      <w:r>
-        <w:rPr>
-          <w:rFonts w:ascii="Courier New" w:hAnsi="Courier New" w:cs="Courier New"/>
-          <w:lang w:val="en-US"/>
-        </w:rPr>
-        <w:t>rawMsg.data, 48, 12);</w:t>
+        <w:t>    rawVal = UnpackSignal(rawMsg.data, 48, 12);</w:t>
       </w:r>
     </w:p>
     <w:p>
@@ -5012,23 +4197,7 @@
           <w:rFonts w:ascii="Courier New" w:hAnsi="Courier New" w:cs="Courier New"/>
           <w:lang w:val="en-US"/>
         </w:rPr>
-        <w:t>    if(_phlp-&gt;Pwr_Act_</w:t>
-      </w:r>
-      <w:proofErr w:type="gramStart"/>
-      <w:r>
-        <w:rPr>
-          <w:rFonts w:ascii="Courier New" w:hAnsi="Courier New" w:cs="Courier New"/>
-          <w:lang w:val="en-US"/>
-        </w:rPr>
-        <w:t>MotFR !</w:t>
-      </w:r>
-      <w:proofErr w:type="gramEnd"/>
-      <w:r>
-        <w:rPr>
-          <w:rFonts w:ascii="Courier New" w:hAnsi="Courier New" w:cs="Courier New"/>
-          <w:lang w:val="en-US"/>
-        </w:rPr>
-        <w:t>= rawVal) {</w:t>
+        <w:t>    if(_phlp-&gt;Pwr_Act_MotFR != rawVal) {</w:t>
       </w:r>
     </w:p>
     <w:p>
@@ -5300,23 +4469,7 @@
           <w:rFonts w:ascii="Courier New" w:hAnsi="Courier New" w:cs="Courier New"/>
           <w:lang w:val="en-US"/>
         </w:rPr>
-        <w:t>void Screen1</w:t>
-      </w:r>
-      <w:proofErr w:type="gramStart"/>
-      <w:r>
-        <w:rPr>
-          <w:rFonts w:ascii="Courier New" w:hAnsi="Courier New" w:cs="Courier New"/>
-          <w:lang w:val="en-US"/>
-        </w:rPr>
-        <w:t>Presenter::updatePressHydLightPt(</w:t>
-      </w:r>
-      <w:proofErr w:type="gramEnd"/>
-      <w:r>
-        <w:rPr>
-          <w:rFonts w:ascii="Courier New" w:hAnsi="Courier New" w:cs="Courier New"/>
-          <w:lang w:val="en-US"/>
-        </w:rPr>
-        <w:t>Press_Hydraulic_Light_PowerTrain_t data) {</w:t>
+        <w:t>void Screen1Presenter::updatePressHydLightPt(Press_Hydraulic_Light_PowerTrain_t data) {</w:t>
       </w:r>
     </w:p>
     <w:p>
@@ -5334,21 +4487,12 @@
         </w:rPr>
         <w:t xml:space="preserve">    </w:t>
       </w:r>
-      <w:proofErr w:type="gramStart"/>
-      <w:r>
-        <w:rPr>
-          <w:rFonts w:ascii="Courier New" w:hAnsi="Courier New" w:cs="Courier New"/>
-          <w:lang w:val="en-US"/>
-        </w:rPr>
-        <w:t>view.showPressHydLightPt</w:t>
-      </w:r>
-      <w:proofErr w:type="gramEnd"/>
-      <w:r>
-        <w:rPr>
-          <w:rFonts w:ascii="Courier New" w:hAnsi="Courier New" w:cs="Courier New"/>
-          <w:lang w:val="en-US"/>
-        </w:rPr>
-        <w:t>(data);</w:t>
+      <w:r>
+        <w:rPr>
+          <w:rFonts w:ascii="Courier New" w:hAnsi="Courier New" w:cs="Courier New"/>
+          <w:lang w:val="en-US"/>
+        </w:rPr>
+        <w:t>view.showPressHydLightPt(data);</w:t>
       </w:r>
     </w:p>
     <w:p>
@@ -5422,6 +4566,7 @@
       <w:r>
         <w:rPr>
           <w:rFonts w:ascii="Calibri" w:hAnsi="Calibri" w:cs="Calibri"/>
+          <w:noProof/>
           <w:lang w:val="en-US"/>
         </w:rPr>
         <w:drawing>
@@ -5437,92 +4582,6 @@
                 <pic:pic xmlns:pic="http://schemas.openxmlformats.org/drawingml/2006/picture">
                   <pic:nvPicPr>
                     <pic:cNvPr id="1921409970" name=""/>
-                    <pic:cNvPicPr/>
-                  </pic:nvPicPr>
-                  <pic:blipFill>
-                    <a:blip r:embed="rId23"/>
-                    <a:stretch>
-                      <a:fillRect/>
-                    </a:stretch>
-                  </pic:blipFill>
-                  <pic:spPr>
-                    <a:xfrm>
-                      <a:off x="0" y="0"/>
-                      <a:ext cx="5760720" cy="3420745"/>
-                    </a:xfrm>
-                    <a:prstGeom prst="rect">
-                      <a:avLst/>
-                    </a:prstGeom>
-                  </pic:spPr>
-                </pic:pic>
-              </a:graphicData>
-            </a:graphic>
-          </wp:inline>
-        </w:drawing>
-      </w:r>
-    </w:p>
-    <w:p>
-      <w:pPr>
-        <w:rPr>
-          <w:rFonts w:cs="Calibri"/>
-          <w:lang w:val="en-US"/>
-        </w:rPr>
-      </w:pPr>
-      <w:r>
-        <w:rPr>
-          <w:rFonts w:cs="Calibri"/>
-          <w:lang w:val="en-US"/>
-        </w:rPr>
-        <w:t xml:space="preserve">When a text box is added, we must first set the “name” of the text box. This is done from the top right corner (“presFront”). The next step is to tell TouchGFX that the value here is dynamic. In the </w:t>
-      </w:r>
-      <w:r>
-        <w:rPr>
-          <w:rFonts w:cs="Calibri"/>
-          <w:lang w:val="en-US"/>
-        </w:rPr>
-        <w:t>right</w:t>
-      </w:r>
-      <w:r>
-        <w:rPr>
-          <w:rFonts w:cs="Calibri"/>
-          <w:lang w:val="en-US"/>
-        </w:rPr>
-        <w:t xml:space="preserve"> pane, under the Translation option, you can set what this text box must display, and also that some of that data is dynamic. Ensure that Wildcard1 and Wildcard2 is selected as, in this text box, we have two dynamic values. Also,</w:t>
-      </w:r>
-      <w:r>
-        <w:rPr>
-          <w:rFonts w:cs="Calibri"/>
-          <w:lang w:val="en-US"/>
-        </w:rPr>
-        <w:t xml:space="preserve"> ensure that you set the size of the dynamic data by clicking on Wildcard1 and Wildcard2 as shown below:</w:t>
-      </w:r>
-    </w:p>
-    <w:p>
-      <w:pPr>
-        <w:rPr>
-          <w:rFonts w:ascii="Calibri" w:hAnsi="Calibri" w:cs="Calibri"/>
-          <w:lang w:val="en-US"/>
-        </w:rPr>
-      </w:pPr>
-      <w:r>
-        <w:rPr>
-          <w:rFonts w:ascii="Calibri" w:hAnsi="Calibri" w:cs="Calibri"/>
-          <w:lang w:val="en-US"/>
-        </w:rPr>
-        <w:lastRenderedPageBreak/>
-        <w:drawing>
-          <wp:inline distT="0" distB="0" distL="0" distR="0" wp14:anchorId="76B6D3A6" wp14:editId="1871337D">
-            <wp:extent cx="5760720" cy="3420745"/>
-            <wp:effectExtent l="0" t="0" r="0" b="8255"/>
-            <wp:docPr id="1426751195" name="Picture 1"/>
-            <wp:cNvGraphicFramePr>
-              <a:graphicFrameLocks xmlns:a="http://schemas.openxmlformats.org/drawingml/2006/main" noChangeAspect="1"/>
-            </wp:cNvGraphicFramePr>
-            <a:graphic xmlns:a="http://schemas.openxmlformats.org/drawingml/2006/main">
-              <a:graphicData uri="http://schemas.openxmlformats.org/drawingml/2006/picture">
-                <pic:pic xmlns:pic="http://schemas.openxmlformats.org/drawingml/2006/picture">
-                  <pic:nvPicPr>
-                    <pic:cNvPr id="1426751195" name=""/>
                     <pic:cNvPicPr/>
                   </pic:nvPicPr>
                   <pic:blipFill>
@@ -5546,11 +4605,98 @@
           </wp:inline>
         </w:drawing>
       </w:r>
-      <w:r>
+    </w:p>
+    <w:p>
+      <w:pPr>
+        <w:rPr>
+          <w:rFonts w:cs="Calibri"/>
+          <w:lang w:val="en-US"/>
+        </w:rPr>
+      </w:pPr>
+      <w:r>
+        <w:rPr>
+          <w:rFonts w:cs="Calibri"/>
+          <w:lang w:val="en-US"/>
+        </w:rPr>
+        <w:t xml:space="preserve">When a text box is added, we must first set the “name” of the text box. This is done from the top right corner (“presFront”). The next step is to tell TouchGFX that the value here is dynamic. In the </w:t>
+      </w:r>
+      <w:r>
+        <w:rPr>
+          <w:rFonts w:cs="Calibri"/>
+          <w:lang w:val="en-US"/>
+        </w:rPr>
+        <w:t>right</w:t>
+      </w:r>
+      <w:r>
+        <w:rPr>
+          <w:rFonts w:cs="Calibri"/>
+          <w:lang w:val="en-US"/>
+        </w:rPr>
+        <w:t xml:space="preserve"> pane, under the Translation option, you can set what this text box must display, and also that some of that data is dynamic. Ensure that Wildcard1 and Wildcard2 is selected as, in this text box, we have two dynamic values. Also,</w:t>
+      </w:r>
+      <w:r>
+        <w:rPr>
+          <w:rFonts w:cs="Calibri"/>
+          <w:lang w:val="en-US"/>
+        </w:rPr>
+        <w:t xml:space="preserve"> ensure that you set the size of the dynamic data by clicking on Wildcard1 and Wildcard2 as shown below:</w:t>
+      </w:r>
+    </w:p>
+    <w:p>
+      <w:pPr>
         <w:rPr>
           <w:rFonts w:ascii="Calibri" w:hAnsi="Calibri" w:cs="Calibri"/>
           <w:lang w:val="en-US"/>
         </w:rPr>
+      </w:pPr>
+      <w:r>
+        <w:rPr>
+          <w:rFonts w:ascii="Calibri" w:hAnsi="Calibri" w:cs="Calibri"/>
+          <w:noProof/>
+          <w:lang w:val="en-US"/>
+        </w:rPr>
+        <w:lastRenderedPageBreak/>
+        <w:drawing>
+          <wp:inline distT="0" distB="0" distL="0" distR="0" wp14:anchorId="76B6D3A6" wp14:editId="1871337D">
+            <wp:extent cx="5760720" cy="3420745"/>
+            <wp:effectExtent l="0" t="0" r="0" b="8255"/>
+            <wp:docPr id="1426751195" name="Picture 1"/>
+            <wp:cNvGraphicFramePr>
+              <a:graphicFrameLocks xmlns:a="http://schemas.openxmlformats.org/drawingml/2006/main" noChangeAspect="1"/>
+            </wp:cNvGraphicFramePr>
+            <a:graphic xmlns:a="http://schemas.openxmlformats.org/drawingml/2006/main">
+              <a:graphicData uri="http://schemas.openxmlformats.org/drawingml/2006/picture">
+                <pic:pic xmlns:pic="http://schemas.openxmlformats.org/drawingml/2006/picture">
+                  <pic:nvPicPr>
+                    <pic:cNvPr id="1426751195" name=""/>
+                    <pic:cNvPicPr/>
+                  </pic:nvPicPr>
+                  <pic:blipFill>
+                    <a:blip r:embed="rId25"/>
+                    <a:stretch>
+                      <a:fillRect/>
+                    </a:stretch>
+                  </pic:blipFill>
+                  <pic:spPr>
+                    <a:xfrm>
+                      <a:off x="0" y="0"/>
+                      <a:ext cx="5760720" cy="3420745"/>
+                    </a:xfrm>
+                    <a:prstGeom prst="rect">
+                      <a:avLst/>
+                    </a:prstGeom>
+                  </pic:spPr>
+                </pic:pic>
+              </a:graphicData>
+            </a:graphic>
+          </wp:inline>
+        </w:drawing>
+      </w:r>
+      <w:r>
+        <w:rPr>
+          <w:rFonts w:ascii="Calibri" w:hAnsi="Calibri" w:cs="Calibri"/>
+          <w:lang w:val="en-US"/>
+        </w:rPr>
         <w:t xml:space="preserve"> </w:t>
       </w:r>
     </w:p>
@@ -5601,80 +4747,44 @@
           <w:lang w:val="fr-FR"/>
         </w:rPr>
       </w:pPr>
-      <w:proofErr w:type="gramStart"/>
       <w:r>
         <w:rPr>
           <w:rFonts w:ascii="Courier New" w:hAnsi="Courier New" w:cs="Courier New"/>
           <w:lang w:val="fr-FR"/>
         </w:rPr>
-        <w:t>touchgfx::Unicode::</w:t>
-      </w:r>
-      <w:proofErr w:type="gramEnd"/>
-      <w:r>
+        <w:t>touchgfx::Unicode::UnicodeChar presFrontBuffer1[PRESFRONTBUFFER1_SIZE];</w:t>
+      </w:r>
+    </w:p>
+    <w:p>
+      <w:pPr>
+        <w:spacing w:after="0"/>
+        <w:rPr>
+          <w:rFonts w:ascii="Courier New" w:hAnsi="Courier New" w:cs="Courier New"/>
+          <w:lang w:val="en-US"/>
+        </w:rPr>
+      </w:pPr>
+      <w:r>
+        <w:rPr>
+          <w:rFonts w:ascii="Courier New" w:hAnsi="Courier New" w:cs="Courier New"/>
+          <w:lang w:val="en-US"/>
+        </w:rPr>
+        <w:t>static const uint16_t PRESFRONTBUFFER2_SIZE = 10;</w:t>
+      </w:r>
+    </w:p>
+    <w:p>
+      <w:pPr>
         <w:rPr>
           <w:rFonts w:ascii="Courier New" w:hAnsi="Courier New" w:cs="Courier New"/>
           <w:lang w:val="fr-FR"/>
         </w:rPr>
-        <w:t>UnicodeChar presFrontBuffer1[PRESFRONTBUFFER1_SIZE</w:t>
-      </w:r>
-      <w:proofErr w:type="gramStart"/>
+      </w:pPr>
       <w:r>
         <w:rPr>
           <w:rFonts w:ascii="Courier New" w:hAnsi="Courier New" w:cs="Courier New"/>
           <w:lang w:val="fr-FR"/>
         </w:rPr>
-        <w:t>];</w:t>
-      </w:r>
-      <w:proofErr w:type="gramEnd"/>
-    </w:p>
-    <w:p>
-      <w:pPr>
-        <w:spacing w:after="0"/>
-        <w:rPr>
-          <w:rFonts w:ascii="Courier New" w:hAnsi="Courier New" w:cs="Courier New"/>
-          <w:lang w:val="en-US"/>
-        </w:rPr>
-      </w:pPr>
-      <w:r>
-        <w:rPr>
-          <w:rFonts w:ascii="Courier New" w:hAnsi="Courier New" w:cs="Courier New"/>
-          <w:lang w:val="en-US"/>
-        </w:rPr>
-        <w:t>static const uint16_t PRESFRONTBUFFER2_SIZE = 10;</w:t>
-      </w:r>
-    </w:p>
-    <w:p>
-      <w:pPr>
-        <w:rPr>
-          <w:rFonts w:ascii="Courier New" w:hAnsi="Courier New" w:cs="Courier New"/>
-          <w:lang w:val="fr-FR"/>
-        </w:rPr>
-      </w:pPr>
-      <w:proofErr w:type="gramStart"/>
-      <w:r>
-        <w:rPr>
-          <w:rFonts w:ascii="Courier New" w:hAnsi="Courier New" w:cs="Courier New"/>
-          <w:lang w:val="fr-FR"/>
-        </w:rPr>
-        <w:t>touchgfx::Unicode::</w:t>
-      </w:r>
-      <w:proofErr w:type="gramEnd"/>
-      <w:r>
-        <w:rPr>
-          <w:rFonts w:ascii="Courier New" w:hAnsi="Courier New" w:cs="Courier New"/>
-          <w:lang w:val="fr-FR"/>
-        </w:rPr>
-        <w:t>UnicodeChar presFrontBuffer2[PRESFRONTBUFFER2_SIZE</w:t>
-      </w:r>
-      <w:proofErr w:type="gramStart"/>
-      <w:r>
-        <w:rPr>
-          <w:rFonts w:ascii="Courier New" w:hAnsi="Courier New" w:cs="Courier New"/>
-          <w:lang w:val="fr-FR"/>
-        </w:rPr>
-        <w:t>];</w:t>
-      </w:r>
-      <w:proofErr w:type="gramEnd"/>
+        <w:t>touchgfx::Unicode::UnicodeChar presFrontBuffer2[PRESFRONTBUFFER2_SIZE];</w:t>
+      </w:r>
     </w:p>
     <w:p>
       <w:pPr>
@@ -5717,23 +4827,7 @@
           <w:rFonts w:ascii="Courier New" w:hAnsi="Courier New" w:cs="Courier New"/>
           <w:lang w:val="en-US"/>
         </w:rPr>
-        <w:t xml:space="preserve">void </w:t>
-      </w:r>
-      <w:proofErr w:type="gramStart"/>
-      <w:r>
-        <w:rPr>
-          <w:rFonts w:ascii="Courier New" w:hAnsi="Courier New" w:cs="Courier New"/>
-          <w:lang w:val="en-US"/>
-        </w:rPr>
-        <w:t>showPressHydLightPt(</w:t>
-      </w:r>
-      <w:proofErr w:type="gramEnd"/>
-      <w:r>
-        <w:rPr>
-          <w:rFonts w:ascii="Courier New" w:hAnsi="Courier New" w:cs="Courier New"/>
-          <w:lang w:val="en-US"/>
-        </w:rPr>
-        <w:t>Press_Hydraulic_Light_PowerTrain_t);</w:t>
+        <w:t>void showPressHydLightPt(Press_Hydraulic_Light_PowerTrain_t);</w:t>
       </w:r>
     </w:p>
     <w:p>
@@ -5764,71 +4858,23 @@
           <w:rFonts w:ascii="Courier New" w:hAnsi="Courier New" w:cs="Courier New"/>
           <w:lang w:val="en-US"/>
         </w:rPr>
-        <w:t>void Screen1</w:t>
-      </w:r>
-      <w:proofErr w:type="gramStart"/>
-      <w:r>
-        <w:rPr>
-          <w:rFonts w:ascii="Courier New" w:hAnsi="Courier New" w:cs="Courier New"/>
-          <w:lang w:val="en-US"/>
-        </w:rPr>
-        <w:t>View::showPressHydLightPt(</w:t>
-      </w:r>
-      <w:proofErr w:type="gramEnd"/>
-      <w:r>
-        <w:rPr>
-          <w:rFonts w:ascii="Courier New" w:hAnsi="Courier New" w:cs="Courier New"/>
-          <w:lang w:val="en-US"/>
-        </w:rPr>
-        <w:t>Press_Hydraulic_Light_PowerTrain_t phlp) {</w:t>
-      </w:r>
-    </w:p>
-    <w:p>
-      <w:pPr>
-        <w:spacing w:after="0"/>
-        <w:rPr>
-          <w:rFonts w:ascii="Courier New" w:hAnsi="Courier New" w:cs="Courier New"/>
-          <w:lang w:val="en-US"/>
-        </w:rPr>
-      </w:pPr>
-      <w:r>
-        <w:rPr>
-          <w:rFonts w:ascii="Courier New" w:hAnsi="Courier New" w:cs="Courier New"/>
-          <w:lang w:val="en-US"/>
-        </w:rPr>
-        <w:t xml:space="preserve">    </w:t>
-      </w:r>
-      <w:proofErr w:type="gramStart"/>
-      <w:r>
-        <w:rPr>
-          <w:rFonts w:ascii="Courier New" w:hAnsi="Courier New" w:cs="Courier New"/>
-          <w:lang w:val="en-US"/>
-        </w:rPr>
-        <w:t>Unicode::snprintf(</w:t>
-      </w:r>
-      <w:proofErr w:type="gramEnd"/>
-      <w:r>
-        <w:rPr>
-          <w:rFonts w:ascii="Courier New" w:hAnsi="Courier New" w:cs="Courier New"/>
-          <w:lang w:val="en-US"/>
-        </w:rPr>
-        <w:t xml:space="preserve">susFBuffer, SUSF_SIZE, "%d", </w:t>
-      </w:r>
-      <w:proofErr w:type="gramStart"/>
-      <w:r>
-        <w:rPr>
-          <w:rFonts w:ascii="Courier New" w:hAnsi="Courier New" w:cs="Courier New"/>
-          <w:lang w:val="en-US"/>
-        </w:rPr>
-        <w:t>phlp.Pres</w:t>
-      </w:r>
-      <w:proofErr w:type="gramEnd"/>
-      <w:r>
-        <w:rPr>
-          <w:rFonts w:ascii="Courier New" w:hAnsi="Courier New" w:cs="Courier New"/>
-          <w:lang w:val="en-US"/>
-        </w:rPr>
-        <w:t>_Susp_Front);</w:t>
+        <w:t>void Screen1View::showPressHydLightPt(Press_Hydraulic_Light_PowerTrain_t phlp) {</w:t>
+      </w:r>
+    </w:p>
+    <w:p>
+      <w:pPr>
+        <w:spacing w:after="0"/>
+        <w:rPr>
+          <w:rFonts w:ascii="Courier New" w:hAnsi="Courier New" w:cs="Courier New"/>
+          <w:lang w:val="en-US"/>
+        </w:rPr>
+      </w:pPr>
+      <w:r>
+        <w:rPr>
+          <w:rFonts w:ascii="Courier New" w:hAnsi="Courier New" w:cs="Courier New"/>
+          <w:lang w:val="en-US"/>
+        </w:rPr>
+        <w:t>    Unicode::snprintf(susFBuffer, SUSF_SIZE, "%d", phlp.Pres_Susp_Front);</w:t>
       </w:r>
     </w:p>
     <w:p>
@@ -5870,39 +4916,7 @@
           <w:rFonts w:ascii="Courier New" w:hAnsi="Courier New" w:cs="Courier New"/>
           <w:lang w:val="en-US"/>
         </w:rPr>
-        <w:t xml:space="preserve">    </w:t>
-      </w:r>
-      <w:proofErr w:type="gramStart"/>
-      <w:r>
-        <w:rPr>
-          <w:rFonts w:ascii="Courier New" w:hAnsi="Courier New" w:cs="Courier New"/>
-          <w:lang w:val="en-US"/>
-        </w:rPr>
-        <w:t>Unicode::snprintf(</w:t>
-      </w:r>
-      <w:proofErr w:type="gramEnd"/>
-      <w:r>
-        <w:rPr>
-          <w:rFonts w:ascii="Courier New" w:hAnsi="Courier New" w:cs="Courier New"/>
-          <w:lang w:val="en-US"/>
-        </w:rPr>
-        <w:t xml:space="preserve">susRBuffer, SUSR_SIZE, "%d", </w:t>
-      </w:r>
-      <w:proofErr w:type="gramStart"/>
-      <w:r>
-        <w:rPr>
-          <w:rFonts w:ascii="Courier New" w:hAnsi="Courier New" w:cs="Courier New"/>
-          <w:lang w:val="en-US"/>
-        </w:rPr>
-        <w:t>phlp.Pres</w:t>
-      </w:r>
-      <w:proofErr w:type="gramEnd"/>
-      <w:r>
-        <w:rPr>
-          <w:rFonts w:ascii="Courier New" w:hAnsi="Courier New" w:cs="Courier New"/>
-          <w:lang w:val="en-US"/>
-        </w:rPr>
-        <w:t>_Susp_Rear);</w:t>
+        <w:t>    Unicode::snprintf(susRBuffer, SUSR_SIZE, "%d", phlp.Pres_Susp_Rear);</w:t>
       </w:r>
     </w:p>
     <w:p>
@@ -5943,39 +4957,7 @@
           <w:rFonts w:ascii="Courier New" w:hAnsi="Courier New" w:cs="Courier New"/>
           <w:lang w:val="en-US"/>
         </w:rPr>
-        <w:t xml:space="preserve">    </w:t>
-      </w:r>
-      <w:proofErr w:type="gramStart"/>
-      <w:r>
-        <w:rPr>
-          <w:rFonts w:ascii="Courier New" w:hAnsi="Courier New" w:cs="Courier New"/>
-          <w:lang w:val="en-US"/>
-        </w:rPr>
-        <w:t>Unicode::snprintf(</w:t>
-      </w:r>
-      <w:proofErr w:type="gramEnd"/>
-      <w:r>
-        <w:rPr>
-          <w:rFonts w:ascii="Courier New" w:hAnsi="Courier New" w:cs="Courier New"/>
-          <w:lang w:val="en-US"/>
-        </w:rPr>
-        <w:t xml:space="preserve">brkPresFBuffer, BRKPRESF_SIZE, "%d", </w:t>
-      </w:r>
-      <w:proofErr w:type="gramStart"/>
-      <w:r>
-        <w:rPr>
-          <w:rFonts w:ascii="Courier New" w:hAnsi="Courier New" w:cs="Courier New"/>
-          <w:lang w:val="en-US"/>
-        </w:rPr>
-        <w:t>phlp.Pres</w:t>
-      </w:r>
-      <w:proofErr w:type="gramEnd"/>
-      <w:r>
-        <w:rPr>
-          <w:rFonts w:ascii="Courier New" w:hAnsi="Courier New" w:cs="Courier New"/>
-          <w:lang w:val="en-US"/>
-        </w:rPr>
-        <w:t>_Brk_Front);</w:t>
+        <w:t>    Unicode::snprintf(brkPresFBuffer, BRKPRESF_SIZE, "%d", phlp.Pres_Brk_Front);</w:t>
       </w:r>
     </w:p>
     <w:p>
@@ -6016,39 +4998,7 @@
           <w:rFonts w:ascii="Courier New" w:hAnsi="Courier New" w:cs="Courier New"/>
           <w:lang w:val="en-US"/>
         </w:rPr>
-        <w:t xml:space="preserve">    </w:t>
-      </w:r>
-      <w:proofErr w:type="gramStart"/>
-      <w:r>
-        <w:rPr>
-          <w:rFonts w:ascii="Courier New" w:hAnsi="Courier New" w:cs="Courier New"/>
-          <w:lang w:val="en-US"/>
-        </w:rPr>
-        <w:t>Unicode::snprintf(</w:t>
-      </w:r>
-      <w:proofErr w:type="gramEnd"/>
-      <w:r>
-        <w:rPr>
-          <w:rFonts w:ascii="Courier New" w:hAnsi="Courier New" w:cs="Courier New"/>
-          <w:lang w:val="en-US"/>
-        </w:rPr>
-        <w:t xml:space="preserve">brkPresRBuffer, BRKPRESR_SIZE, "%d", </w:t>
-      </w:r>
-      <w:proofErr w:type="gramStart"/>
-      <w:r>
-        <w:rPr>
-          <w:rFonts w:ascii="Courier New" w:hAnsi="Courier New" w:cs="Courier New"/>
-          <w:lang w:val="en-US"/>
-        </w:rPr>
-        <w:t>phlp.Pres</w:t>
-      </w:r>
-      <w:proofErr w:type="gramEnd"/>
-      <w:r>
-        <w:rPr>
-          <w:rFonts w:ascii="Courier New" w:hAnsi="Courier New" w:cs="Courier New"/>
-          <w:lang w:val="en-US"/>
-        </w:rPr>
-        <w:t>_Brk_Rear);</w:t>
+        <w:t>    Unicode::snprintf(brkPresRBuffer, BRKPRESR_SIZE, "%d", phlp.Pres_Brk_Rear);</w:t>
       </w:r>
     </w:p>
     <w:p>
@@ -6096,21 +5046,12 @@
         </w:rPr>
         <w:t xml:space="preserve">If you look closely, there is a pattern. We use the </w:t>
       </w:r>
-      <w:proofErr w:type="gramStart"/>
       <w:r>
         <w:rPr>
           <w:rFonts w:cs="Courier New"/>
           <w:lang w:val="en-US"/>
         </w:rPr>
-        <w:t>Unicode::</w:t>
-      </w:r>
-      <w:proofErr w:type="gramEnd"/>
-      <w:r>
-        <w:rPr>
-          <w:rFonts w:cs="Courier New"/>
-          <w:lang w:val="en-US"/>
-        </w:rPr>
-        <w:t>snprintf</w:t>
+        <w:t>Unicode::snprintf</w:t>
       </w:r>
       <w:r>
         <w:rPr>
@@ -6444,7 +5385,7 @@
       <w:pPr>
         <w:rPr>
           <w:rFonts w:cs="Calibri"/>
-          <w:lang w:val="de-DE"/>
+          <w:lang w:val="en-US"/>
         </w:rPr>
       </w:pPr>
       <w:r>
@@ -6560,23 +5501,7 @@
           <w:rFonts w:ascii="Courier New" w:hAnsi="Courier New" w:cs="Courier New"/>
           <w:lang w:val="en-US"/>
         </w:rPr>
-        <w:t xml:space="preserve">sFilterConfig2.FilterIndex = </w:t>
-      </w:r>
-      <w:proofErr w:type="gramStart"/>
-      <w:r>
-        <w:rPr>
-          <w:rFonts w:ascii="Courier New" w:hAnsi="Courier New" w:cs="Courier New"/>
-          <w:lang w:val="en-US"/>
-        </w:rPr>
-        <w:t xml:space="preserve">1;   </w:t>
-      </w:r>
-      <w:proofErr w:type="gramEnd"/>
-      <w:r>
-        <w:rPr>
-          <w:rFonts w:ascii="Courier New" w:hAnsi="Courier New" w:cs="Courier New"/>
-          <w:lang w:val="en-US"/>
-        </w:rPr>
-        <w:t xml:space="preserve">       // Use Index 1 (don't overwrite Index 0)</w:t>
+        <w:t>sFilterConfig2.FilterIndex = 1;          // Use Index 1 (don't overwrite Index 0)</w:t>
       </w:r>
     </w:p>
     <w:p>
@@ -6671,23 +5596,7 @@
           <w:rFonts w:ascii="Courier New" w:hAnsi="Courier New" w:cs="Courier New"/>
           <w:lang w:val="it-IT"/>
         </w:rPr>
-        <w:t>HAL_FDCAN_</w:t>
-      </w:r>
-      <w:proofErr w:type="gramStart"/>
-      <w:r>
-        <w:rPr>
-          <w:rFonts w:ascii="Courier New" w:hAnsi="Courier New" w:cs="Courier New"/>
-          <w:lang w:val="it-IT"/>
-        </w:rPr>
-        <w:t>ConfigFilter(</w:t>
-      </w:r>
-      <w:proofErr w:type="gramEnd"/>
-      <w:r>
-        <w:rPr>
-          <w:rFonts w:ascii="Courier New" w:hAnsi="Courier New" w:cs="Courier New"/>
-          <w:lang w:val="it-IT"/>
-        </w:rPr>
-        <w:t>&amp;hfdcan1, &amp;sFilterConfig2);</w:t>
+        <w:t>HAL_FDCAN_ConfigFilter(&amp;hfdcan1, &amp;sFilterConfig2);</w:t>
       </w:r>
     </w:p>
     <w:p>
@@ -6724,67 +5633,51 @@
           <w:rFonts w:cs="Calibri"/>
           <w:lang w:val="en-US"/>
         </w:rPr>
-        <w:t>The good thing is that all signals are Intel (Little Endian) byte ordered. However, in the future there might be</w:t>
+        <w:t xml:space="preserve">The good thing is that all signals are Intel (Little Endian) byte ordered. However, in the future there might be signals that are big-endian byte ordered. The FDCAN driver already features a </w:t>
       </w:r>
       <w:r>
         <w:rPr>
           <w:rFonts w:cs="Calibri"/>
           <w:lang w:val="en-US"/>
         </w:rPr>
-        <w:t xml:space="preserve"> signals that are big-endian byte ordered. The FDCAN driver already features a </w:t>
-      </w:r>
-      <w:r>
+        <w:t>big-endian signal unpacker and a packer that can be used in these cases. The arguments are all absolutely the same and the Model-side code doesn’t change. Only ensure that the correct packer/unpacker is called.</w:t>
+      </w:r>
+    </w:p>
+    <w:p>
+      <w:pPr>
         <w:rPr>
           <w:rFonts w:cs="Calibri"/>
           <w:lang w:val="en-US"/>
         </w:rPr>
-        <w:t>big-endian signal unpacker and a packer that can be used in these cases. The arguments are all absolutely the same and the Model-side code doesn’t change. Only ensure that the correct packer/unpacker is called.</w:t>
-      </w:r>
-    </w:p>
-    <w:p>
-      <w:pPr>
+      </w:pPr>
+      <w:r>
         <w:rPr>
           <w:rFonts w:cs="Calibri"/>
           <w:lang w:val="en-US"/>
         </w:rPr>
-      </w:pPr>
-      <w:r>
+        <w:t>Another known issue is that the displayed data is not formatted correctly. For instance, the data is expected with a precision of 2 decimal places but only one (or none) are shown. The problem comes from using the wrong display function.</w:t>
+      </w:r>
+    </w:p>
+    <w:p>
+      <w:pPr>
         <w:rPr>
           <w:rFonts w:cs="Calibri"/>
           <w:lang w:val="en-US"/>
         </w:rPr>
-        <w:t>Another known issue is that the displayed data is not formatted correctly. For instance, the data is expected with a precision of 2 decimal places but only one (or none) are shown. The problem comes from using the wrong display function.</w:t>
-      </w:r>
-    </w:p>
-    <w:p>
-      <w:pPr>
+      </w:pPr>
+      <w:r>
         <w:rPr>
           <w:rFonts w:cs="Calibri"/>
           <w:lang w:val="en-US"/>
         </w:rPr>
-      </w:pPr>
-      <w:r>
-        <w:rPr>
-          <w:rFonts w:cs="Calibri"/>
-          <w:lang w:val="en-US"/>
-        </w:rPr>
         <w:t xml:space="preserve">As we saw above, we used the </w:t>
       </w:r>
-      <w:proofErr w:type="gramStart"/>
       <w:r>
         <w:rPr>
           <w:rFonts w:cs="Courier New"/>
           <w:lang w:val="en-US"/>
         </w:rPr>
-        <w:t>Unicode::</w:t>
-      </w:r>
-      <w:proofErr w:type="gramEnd"/>
-      <w:r>
-        <w:rPr>
-          <w:rFonts w:cs="Courier New"/>
-          <w:lang w:val="en-US"/>
-        </w:rPr>
-        <w:t>snprintf</w:t>
+        <w:t>Unicode::snprintf</w:t>
       </w:r>
       <w:r>
         <w:rPr>
@@ -6808,7 +5701,7 @@
         <w:lastRenderedPageBreak/>
         <w:t xml:space="preserve">suite of APIs that is way too long for this document. But the API documentation can be found </w:t>
       </w:r>
-      <w:hyperlink r:id="rId25" w:history="1">
+      <w:hyperlink r:id="rId26" w:history="1">
         <w:r>
           <w:rPr>
             <w:rStyle w:val="Hyperlink"/>
@@ -6877,7 +5770,7 @@
         </w:rPr>
         <w:t xml:space="preserve">Finally, to understand some more features, TouchGFX provides a lot of examples that you can run on the TouchGFX Simulator. However, note that the RTOS backend doesn’t work on the simulation. But the simulation is quite useful if you want to learn a new widget, for instance, </w:t>
       </w:r>
-      <w:hyperlink r:id="rId26" w:history="1">
+      <w:hyperlink r:id="rId27" w:history="1">
         <w:r>
           <w:rPr>
             <w:rStyle w:val="Hyperlink"/>
@@ -7894,6 +6787,7 @@
   <w:style w:type="character" w:default="1" w:styleId="DefaultParagraphFont">
     <w:name w:val="Default Paragraph Font"/>
     <w:uiPriority w:val="1"/>
+    <w:semiHidden/>
     <w:unhideWhenUsed/>
   </w:style>
   <w:style w:type="table" w:default="1" w:styleId="TableNormal">
@@ -10038,7 +8932,7 @@
   <dgm:whole/>
   <dgm:extLst>
     <a:ext uri="http://schemas.microsoft.com/office/drawing/2008/diagram">
-      <dsp:dataModelExt xmlns:dsp="http://schemas.microsoft.com/office/drawing/2008/diagram" relId="rId11" minVer="http://schemas.openxmlformats.org/drawingml/2006/diagram"/>
+      <dsp:dataModelExt xmlns:dsp="http://schemas.microsoft.com/office/drawing/2008/diagram" relId="rId12" minVer="http://schemas.openxmlformats.org/drawingml/2006/diagram"/>
     </a:ext>
   </dgm:extLst>
 </dgm:dataModel>
@@ -10406,7 +9300,7 @@
   <dgm:whole/>
   <dgm:extLst>
     <a:ext uri="http://schemas.microsoft.com/office/drawing/2008/diagram">
-      <dsp:dataModelExt xmlns:dsp="http://schemas.microsoft.com/office/drawing/2008/diagram" relId="rId16" minVer="http://schemas.openxmlformats.org/drawingml/2006/diagram"/>
+      <dsp:dataModelExt xmlns:dsp="http://schemas.microsoft.com/office/drawing/2008/diagram" relId="rId17" minVer="http://schemas.openxmlformats.org/drawingml/2006/diagram"/>
     </a:ext>
   </dgm:extLst>
 </dgm:dataModel>
@@ -18672,4 +17566,16 @@
     </a:ext>
   </a:extLst>
 </a:theme>
+</file>
+
+<file path=customXml/item1.xml><?xml version="1.0" encoding="utf-8"?>
+<b:Sources xmlns:b="http://schemas.openxmlformats.org/officeDocument/2006/bibliography" xmlns="http://schemas.openxmlformats.org/officeDocument/2006/bibliography" SelectedStyle="\APASixthEditionOfficeOnline.xsl" StyleName="APA" Version="6"/>
+</file>
+
+<file path=customXml/itemProps1.xml><?xml version="1.0" encoding="utf-8"?>
+<ds:datastoreItem xmlns:ds="http://schemas.openxmlformats.org/officeDocument/2006/customXml" ds:itemID="{ACDDA014-C690-4362-B7F7-19C2CDDF9527}">
+  <ds:schemaRefs>
+    <ds:schemaRef ds:uri="http://schemas.openxmlformats.org/officeDocument/2006/bibliography"/>
+  </ds:schemaRefs>
+</ds:datastoreItem>
 </file>
</xml_diff>